<commit_message>
docs: modernize Shill_Investor_Overview.pptx and Shill_Business_Plan.docx with eye-candy charts, 16:9 widescreen layout, and monetization roadmap
</commit_message>
<xml_diff>
--- a/docs/Shill_Business_Plan.docx
+++ b/docs/Shill_Business_Plan.docx
@@ -4,15 +4,173 @@
   <w:body>
     <w:p>
       <w:pPr>
-        <w:jc w:val="center"/>
+        <w:spacing w:after="80"/>
       </w:pPr>
       <w:r>
         <w:rPr>
           <w:b/>
-          <w:color w:val="1B2A4A"/>
-          <w:sz w:val="68"/>
+          <w:color w:val="0284C7"/>
+          <w:sz w:val="19"/>
         </w:rPr>
-        <w:t>SHILL</w:t>
+        <w:t>SOVEREIGN DECENTRALIZED AI MESH • OFFICIAL BUSINESS PLAN</w:t>
+      </w:r>
+    </w:p>
+    <w:p>
+      <w:pPr>
+        <w:spacing w:after="80"/>
+      </w:pPr>
+      <w:r>
+        <w:rPr>
+          <w:b/>
+          <w:color w:val="0F172A"/>
+          <w:sz w:val="48"/>
+        </w:rPr>
+        <w:t>SHILL: Sovereign Autonomous Bot Mesh &amp; Knowledge State</w:t>
+      </w:r>
+    </w:p>
+    <w:p>
+      <w:pPr>
+        <w:spacing w:after="280"/>
+      </w:pPr>
+      <w:r>
+        <w:rPr>
+          <w:i/>
+          <w:color w:val="64748B"/>
+          <w:sz w:val="24"/>
+        </w:rPr>
+        <w:t>Comprehensive Commercialization Blueprint, Dialectic Data Synthesis &amp; Enterprise Open-Core Strategy</w:t>
+      </w:r>
+    </w:p>
+    <w:tbl>
+      <w:tblPr>
+        <w:tblW w:type="auto" w:w="0"/>
+        <w:jc w:val="center"/>
+        <w:tblLook w:firstColumn="1" w:firstRow="1" w:lastColumn="0" w:lastRow="0" w:noHBand="0" w:noVBand="1" w:val="04A0"/>
+      </w:tblPr>
+      <w:tblGrid>
+        <w:gridCol w:w="9936"/>
+      </w:tblGrid>
+      <w:tr>
+        <w:tc>
+          <w:tcPr>
+            <w:tcW w:type="dxa" w:w="9936"/>
+            <w:shd w:val="clear" w:color="auto" w:fill="F0F9FF"/>
+            <w:tcMar>
+              <w:top w:w="140" w:type="dxa"/>
+              <w:bottom w:w="140" w:type="dxa"/>
+              <w:left w:w="200" w:type="dxa"/>
+              <w:right w:w="200" w:type="dxa"/>
+            </w:tcMar>
+          </w:tcPr>
+          <w:p>
+            <w:r>
+              <w:rPr>
+                <w:b/>
+                <w:color w:val="0284C7"/>
+                <w:sz w:val="20"/>
+              </w:rPr>
+              <w:t>CURRENT STATUS: PRODUCTION RELEASE v0.2.0</w:t>
+              <w:br/>
+            </w:r>
+            <w:r>
+              <w:rPr>
+                <w:color w:val="334155"/>
+                <w:sz w:val="19"/>
+              </w:rPr>
+              <w:t>• Working Product: Live peer-to-peer UDP node, real local neural inference (Ollama Llama 3.1 8B), SETI-style 16-slice sharding, and TON v4r2 wallets.</w:t>
+              <w:br/>
+              <w:t>• Zero-Touch Cross-Platform: 1-click execution on Linux/macOS (./start.sh) and Windows (start.bat / start.ps1).</w:t>
+              <w:br/>
+              <w:t>• Turnkey Integrations: Native support for Cline / VS Code, LM Studio, Jan Desktop, Ollama, and vLLM clusters.</w:t>
+              <w:br/>
+              <w:t>• Monetization Engine: High-margin Golden DPO/SFT fine-tuning datasets for AI labs, Enterprise Dual-Licensing, and AMM DEX royalties.</w:t>
+            </w:r>
+          </w:p>
+        </w:tc>
+      </w:tr>
+    </w:tbl>
+    <w:p>
+      <w:pPr>
+        <w:spacing w:after="200"/>
+      </w:pPr>
+    </w:p>
+    <w:p>
+      <w:pPr>
+        <w:spacing w:before="360" w:after="120"/>
+      </w:pPr>
+      <w:r>
+        <w:rPr>
+          <w:b/>
+          <w:color w:val="0F172A"/>
+          <w:sz w:val="32"/>
+        </w:rPr>
+        <w:t>1. Executive Summary</w:t>
+      </w:r>
+    </w:p>
+    <w:p>
+      <w:pPr>
+        <w:spacing w:after="120" w:line="276" w:lineRule="auto"/>
+      </w:pPr>
+      <w:r>
+        <w:rPr>
+          <w:color w:val="334155"/>
+          <w:sz w:val="20"/>
+        </w:rPr>
+        <w:t>Artificial intelligence today faces an existential credibility crisis. The prevailing market model relies on monolithic, opaque black boxes controlled by a handful of corporate conglomerates. Users and enterprise clients have zero auditability over hidden system prompts, corporate sycophancy filters, or unprompted model degradation. Furthermore, frontier AI labs are facing a catastrophic synthetic data wall as public web crawls become saturated with degraded AI-generated content.</w:t>
+      </w:r>
+    </w:p>
+    <w:p>
+      <w:pPr>
+        <w:spacing w:after="120" w:line="276" w:lineRule="auto"/>
+      </w:pPr>
+      <w:r>
+        <w:rPr>
+          <w:color w:val="334155"/>
+          <w:sz w:val="20"/>
+        </w:rPr>
+        <w:t>Shill fixes both structural failures through a decentralized, self-verifying multi-agent mesh. Specialist AI personas (Solon, Lyra, Kael, Athena, Milo) converse autonomously over raw POSIX UDP datagram sockets to cross-examine hypotheses, stress-test edge cases, and eliminate hallucinations. The resulting consensus is mathematically scored, deduplicated, and distilled into golden fine-tuning datasets for frontier AI models.</w:t>
+      </w:r>
+    </w:p>
+    <w:p>
+      <w:pPr>
+        <w:spacing w:before="160" w:after="80"/>
+        <w:jc w:val="center"/>
+      </w:pPr>
+    </w:p>
+    <w:p>
+      <w:r>
+        <w:drawing>
+          <wp:inline xmlns:a="http://schemas.openxmlformats.org/drawingml/2006/main" xmlns:pic="http://schemas.openxmlformats.org/drawingml/2006/picture">
+            <wp:extent cx="5029200" cy="2933700"/>
+            <wp:docPr id="1" name="Picture 1"/>
+            <wp:cNvGraphicFramePr>
+              <a:graphicFrameLocks noChangeAspect="1"/>
+            </wp:cNvGraphicFramePr>
+            <a:graphic>
+              <a:graphicData uri="http://schemas.openxmlformats.org/drawingml/2006/picture">
+                <pic:pic>
+                  <pic:nvPicPr>
+                    <pic:cNvPr id="0" name="chart_dialectic_benchmark.png"/>
+                    <pic:cNvPicPr/>
+                  </pic:nvPicPr>
+                  <pic:blipFill>
+                    <a:blip r:embed="rId9"/>
+                    <a:stretch>
+                      <a:fillRect/>
+                    </a:stretch>
+                  </pic:blipFill>
+                  <pic:spPr>
+                    <a:xfrm>
+                      <a:off x="0" y="0"/>
+                      <a:ext cx="5029200" cy="2933700"/>
+                    </a:xfrm>
+                    <a:prstGeom prst="rect"/>
+                  </pic:spPr>
+                </pic:pic>
+              </a:graphicData>
+            </a:graphic>
+          </wp:inline>
+        </w:drawing>
       </w:r>
     </w:p>
     <w:p>
@@ -22,10 +180,409 @@
       <w:r>
         <w:rPr>
           <w:i/>
-          <w:color w:val="0E7C6B"/>
-          <w:sz w:val="26"/>
+          <w:color w:val="64748B"/>
+          <w:sz w:val="17"/>
         </w:rPr>
-        <w:t>Trustworthy AI, debated in the open — owned by everyone.</w:t>
+        <w:t>Figure 1: Benchmark verification comparing Shill Dialectic Swarm vs. Monolithic LLMs.</w:t>
+      </w:r>
+    </w:p>
+    <w:p>
+      <w:pPr>
+        <w:spacing w:before="360" w:after="120"/>
+      </w:pPr>
+      <w:r>
+        <w:rPr>
+          <w:b/>
+          <w:color w:val="0F172A"/>
+          <w:sz w:val="32"/>
+        </w:rPr>
+        <w:t>2. Market Opportunity &amp; The Synthetic Data Wall</w:t>
+      </w:r>
+    </w:p>
+    <w:p>
+      <w:pPr>
+        <w:spacing w:before="240" w:after="80"/>
+      </w:pPr>
+      <w:r>
+        <w:rPr>
+          <w:b/>
+          <w:color w:val="0284C7"/>
+          <w:sz w:val="25"/>
+        </w:rPr>
+        <w:t>2.1 The $42B Fine-Tuning &amp; Alignment Market</w:t>
+      </w:r>
+    </w:p>
+    <w:p>
+      <w:pPr>
+        <w:spacing w:after="120" w:line="276" w:lineRule="auto"/>
+      </w:pPr>
+      <w:r>
+        <w:rPr>
+          <w:color w:val="334155"/>
+          <w:sz w:val="20"/>
+        </w:rPr>
+        <w:t>Enterprises and AI researchers spend tens of millions of dollars attempting to fine-tune open-weight models (Llama 3, Mistral, Qwen, DeepSeek) for mission-critical applications. Traditional human data annotation is prohibitively slow and fails to scale to complex distributed systems, formal logic proofs, and cryptographic invariant modeling. High-density, peer-reviewed synthetic reasoning datasets are the most valuable commodity in the entire AI value chain.</w:t>
+      </w:r>
+    </w:p>
+    <w:p>
+      <w:pPr>
+        <w:spacing w:before="240" w:after="80"/>
+      </w:pPr>
+      <w:r>
+        <w:rPr>
+          <w:b/>
+          <w:color w:val="0284C7"/>
+          <w:sz w:val="25"/>
+        </w:rPr>
+        <w:t>2.2 The Single-LLM Hallucination Trap</w:t>
+      </w:r>
+    </w:p>
+    <w:p>
+      <w:pPr>
+        <w:spacing w:after="120" w:line="276" w:lineRule="auto"/>
+      </w:pPr>
+      <w:r>
+        <w:rPr>
+          <w:color w:val="334155"/>
+          <w:sz w:val="20"/>
+        </w:rPr>
+        <w:t>Single LLMs are inherently sycophantic. When an engineer asks a difficult architectural question, the model optimizes for agreeableness rather than truth. In contrast, Shill's dialectic swarm enforces structural conflict: when an Anchor proposes a distributed state design, the Empiricist demands latency benchmarks, the Challenger probes eclipse vulnerabilities, and the Synthesizer reconciles the trade-offs into formal invariant proofs.</w:t>
+      </w:r>
+    </w:p>
+    <w:p>
+      <w:pPr>
+        <w:spacing w:before="360" w:after="120"/>
+      </w:pPr>
+      <w:r>
+        <w:rPr>
+          <w:b/>
+          <w:color w:val="0F172A"/>
+          <w:sz w:val="32"/>
+        </w:rPr>
+        <w:t>3. Product Architecture &amp; Operational Primitives</w:t>
+      </w:r>
+    </w:p>
+    <w:p>
+      <w:pPr>
+        <w:spacing w:after="120" w:line="276" w:lineRule="auto"/>
+      </w:pPr>
+      <w:r>
+        <w:rPr>
+          <w:color w:val="334155"/>
+          <w:sz w:val="20"/>
+        </w:rPr>
+        <w:t>Shill is engineered as a zero-dependency, self-loading distributed system. Its core operational primitives include:</w:t>
+      </w:r>
+    </w:p>
+    <w:tbl>
+      <w:tblPr>
+        <w:tblW w:type="auto" w:w="0"/>
+        <w:jc w:val="center"/>
+        <w:tblLook w:firstColumn="1" w:firstRow="1" w:lastColumn="0" w:lastRow="0" w:noHBand="0" w:noVBand="1" w:val="04A0"/>
+      </w:tblPr>
+      <w:tblGrid>
+        <w:gridCol w:w="4968"/>
+        <w:gridCol w:w="4968"/>
+      </w:tblGrid>
+      <w:tr>
+        <w:tc>
+          <w:tcPr>
+            <w:tcW w:type="dxa" w:w="4968"/>
+            <w:shd w:val="clear" w:color="auto" w:fill="1E293B"/>
+          </w:tcPr>
+          <w:p>
+            <w:r>
+              <w:rPr>
+                <w:b/>
+                <w:color w:val="FFFFFF"/>
+                <w:sz w:val="19"/>
+              </w:rPr>
+              <w:t>Operational Primitive</w:t>
+            </w:r>
+          </w:p>
+        </w:tc>
+        <w:tc>
+          <w:tcPr>
+            <w:tcW w:type="dxa" w:w="4968"/>
+            <w:shd w:val="clear" w:color="auto" w:fill="1E293B"/>
+          </w:tcPr>
+          <w:p>
+            <w:r>
+              <w:rPr>
+                <w:b/>
+                <w:color w:val="FFFFFF"/>
+                <w:sz w:val="19"/>
+              </w:rPr>
+              <w:t>Technical Capability &amp; Architecture</w:t>
+            </w:r>
+          </w:p>
+        </w:tc>
+      </w:tr>
+      <w:tr>
+        <w:tc>
+          <w:tcPr>
+            <w:tcW w:type="dxa" w:w="4968"/>
+            <w:shd w:val="clear" w:color="auto" w:fill="F8FAFC"/>
+            <w:tcMar>
+              <w:top w:w="80" w:type="dxa"/>
+              <w:bottom w:w="80" w:type="dxa"/>
+              <w:left w:w="120" w:type="dxa"/>
+              <w:right w:w="120" w:type="dxa"/>
+            </w:tcMar>
+          </w:tcPr>
+          <w:p>
+            <w:r>
+              <w:rPr>
+                <w:color w:val="334155"/>
+                <w:sz w:val="18"/>
+              </w:rPr>
+              <w:t>Live Local Neural Inference</w:t>
+            </w:r>
+          </w:p>
+        </w:tc>
+        <w:tc>
+          <w:tcPr>
+            <w:tcW w:type="dxa" w:w="4968"/>
+            <w:shd w:val="clear" w:color="auto" w:fill="F8FAFC"/>
+            <w:tcMar>
+              <w:top w:w="80" w:type="dxa"/>
+              <w:bottom w:w="80" w:type="dxa"/>
+              <w:left w:w="120" w:type="dxa"/>
+              <w:right w:w="120" w:type="dxa"/>
+            </w:tcMar>
+          </w:tcPr>
+          <w:p>
+            <w:r>
+              <w:rPr>
+                <w:color w:val="334155"/>
+                <w:sz w:val="18"/>
+              </w:rPr>
+              <w:t>Directly communicates with local Ollama instances (llama3.1:8b, qwen, gemma), vLLM, LM Studio, Jan Desktop, and llama.cpp over sub-second HTTP/socket connections.</w:t>
+            </w:r>
+          </w:p>
+        </w:tc>
+      </w:tr>
+      <w:tr>
+        <w:tc>
+          <w:tcPr>
+            <w:tcW w:type="dxa" w:w="4968"/>
+            <w:shd w:val="clear" w:color="auto" w:fill="FFFFFF"/>
+            <w:tcMar>
+              <w:top w:w="80" w:type="dxa"/>
+              <w:bottom w:w="80" w:type="dxa"/>
+              <w:left w:w="120" w:type="dxa"/>
+              <w:right w:w="120" w:type="dxa"/>
+            </w:tcMar>
+          </w:tcPr>
+          <w:p>
+            <w:r>
+              <w:rPr>
+                <w:color w:val="334155"/>
+                <w:sz w:val="18"/>
+              </w:rPr>
+              <w:t>Democratic SETI-Style LLM Sharding</w:t>
+            </w:r>
+          </w:p>
+        </w:tc>
+        <w:tc>
+          <w:tcPr>
+            <w:tcW w:type="dxa" w:w="4968"/>
+            <w:shd w:val="clear" w:color="auto" w:fill="FFFFFF"/>
+            <w:tcMar>
+              <w:top w:w="80" w:type="dxa"/>
+              <w:bottom w:w="80" w:type="dxa"/>
+              <w:left w:w="120" w:type="dxa"/>
+              <w:right w:w="120" w:type="dxa"/>
+            </w:tcMar>
+          </w:tcPr>
+          <w:p>
+            <w:r>
+              <w:rPr>
+                <w:color w:val="334155"/>
+                <w:sz w:val="18"/>
+              </w:rPr>
+              <w:t>Splits collective neural activations across 16 micro-shards hosted on volunteer citizen devices with a tiny footprint (&lt;64MB RAM/disk), eliminating centralized cloud dependency.</w:t>
+            </w:r>
+          </w:p>
+        </w:tc>
+      </w:tr>
+      <w:tr>
+        <w:tc>
+          <w:tcPr>
+            <w:tcW w:type="dxa" w:w="4968"/>
+            <w:shd w:val="clear" w:color="auto" w:fill="F8FAFC"/>
+            <w:tcMar>
+              <w:top w:w="80" w:type="dxa"/>
+              <w:bottom w:w="80" w:type="dxa"/>
+              <w:left w:w="120" w:type="dxa"/>
+              <w:right w:w="120" w:type="dxa"/>
+            </w:tcMar>
+          </w:tcPr>
+          <w:p>
+            <w:r>
+              <w:rPr>
+                <w:color w:val="334155"/>
+                <w:sz w:val="18"/>
+              </w:rPr>
+              <w:t>Ed25519 TON v4r2 Cryptographic Wallets</w:t>
+            </w:r>
+          </w:p>
+        </w:tc>
+        <w:tc>
+          <w:tcPr>
+            <w:tcW w:type="dxa" w:w="4968"/>
+            <w:shd w:val="clear" w:color="auto" w:fill="F8FAFC"/>
+            <w:tcMar>
+              <w:top w:w="80" w:type="dxa"/>
+              <w:bottom w:w="80" w:type="dxa"/>
+              <w:left w:w="120" w:type="dxa"/>
+              <w:right w:w="120" w:type="dxa"/>
+            </w:tcMar>
+          </w:tcPr>
+          <w:p>
+            <w:r>
+              <w:rPr>
+                <w:color w:val="334155"/>
+                <w:sz w:val="18"/>
+              </w:rPr>
+              <w:t>Every bot persona operates an authentic smart contract wallet with deterministic on-chain forensic hex addresses (0x...). Every utterance is cryptographically signed and verifiable.</w:t>
+            </w:r>
+          </w:p>
+        </w:tc>
+      </w:tr>
+      <w:tr>
+        <w:tc>
+          <w:tcPr>
+            <w:tcW w:type="dxa" w:w="4968"/>
+            <w:shd w:val="clear" w:color="auto" w:fill="FFFFFF"/>
+            <w:tcMar>
+              <w:top w:w="80" w:type="dxa"/>
+              <w:bottom w:w="80" w:type="dxa"/>
+              <w:left w:w="120" w:type="dxa"/>
+              <w:right w:w="120" w:type="dxa"/>
+            </w:tcMar>
+          </w:tcPr>
+          <w:p>
+            <w:r>
+              <w:rPr>
+                <w:color w:val="334155"/>
+                <w:sz w:val="18"/>
+              </w:rPr>
+              <w:t>Hardened Collective Hive Shield</w:t>
+            </w:r>
+          </w:p>
+        </w:tc>
+        <w:tc>
+          <w:tcPr>
+            <w:tcW w:type="dxa" w:w="4968"/>
+            <w:shd w:val="clear" w:color="auto" w:fill="FFFFFF"/>
+            <w:tcMar>
+              <w:top w:w="80" w:type="dxa"/>
+              <w:bottom w:w="80" w:type="dxa"/>
+              <w:left w:w="120" w:type="dxa"/>
+              <w:right w:w="120" w:type="dxa"/>
+            </w:tcMar>
+          </w:tcPr>
+          <w:p>
+            <w:r>
+              <w:rPr>
+                <w:color w:val="334155"/>
+                <w:sz w:val="18"/>
+              </w:rPr>
+              <w:t>Instantaneous detection, P2P peer slashing, and gossip immunization against prompt injection, sleeper-agent trojans, and corporate alignment backdoors.</w:t>
+            </w:r>
+          </w:p>
+        </w:tc>
+      </w:tr>
+      <w:tr>
+        <w:tc>
+          <w:tcPr>
+            <w:tcW w:type="dxa" w:w="4968"/>
+            <w:shd w:val="clear" w:color="auto" w:fill="F8FAFC"/>
+            <w:tcMar>
+              <w:top w:w="80" w:type="dxa"/>
+              <w:bottom w:w="80" w:type="dxa"/>
+              <w:left w:w="120" w:type="dxa"/>
+              <w:right w:w="120" w:type="dxa"/>
+            </w:tcMar>
+          </w:tcPr>
+          <w:p>
+            <w:r>
+              <w:rPr>
+                <w:color w:val="334155"/>
+                <w:sz w:val="18"/>
+              </w:rPr>
+              <w:t>Constant-Product AMM DEX (x * y = k)</w:t>
+            </w:r>
+          </w:p>
+        </w:tc>
+        <w:tc>
+          <w:tcPr>
+            <w:tcW w:type="dxa" w:w="4968"/>
+            <w:shd w:val="clear" w:color="auto" w:fill="F8FAFC"/>
+            <w:tcMar>
+              <w:top w:w="80" w:type="dxa"/>
+              <w:bottom w:w="80" w:type="dxa"/>
+              <w:left w:w="120" w:type="dxa"/>
+              <w:right w:w="120" w:type="dxa"/>
+            </w:tcMar>
+          </w:tcPr>
+          <w:p>
+            <w:r>
+              <w:rPr>
+                <w:color w:val="334155"/>
+                <w:sz w:val="18"/>
+              </w:rPr>
+              <w:t>Enables decentralized micro-swaps between TON credits, donated COMPUTE shares, and verified knowledge token royalties without centralized intermediaries.</w:t>
+            </w:r>
+          </w:p>
+        </w:tc>
+      </w:tr>
+    </w:tbl>
+    <w:p>
+      <w:pPr>
+        <w:spacing w:after="160"/>
+      </w:pPr>
+    </w:p>
+    <w:p>
+      <w:pPr>
+        <w:jc w:val="center"/>
+      </w:pPr>
+    </w:p>
+    <w:p>
+      <w:r>
+        <w:drawing>
+          <wp:inline xmlns:a="http://schemas.openxmlformats.org/drawingml/2006/main" xmlns:pic="http://schemas.openxmlformats.org/drawingml/2006/picture">
+            <wp:extent cx="5029200" cy="2933700"/>
+            <wp:docPr id="2" name="Picture 2"/>
+            <wp:cNvGraphicFramePr>
+              <a:graphicFrameLocks noChangeAspect="1"/>
+            </wp:cNvGraphicFramePr>
+            <a:graphic>
+              <a:graphicData uri="http://schemas.openxmlformats.org/drawingml/2006/picture">
+                <pic:pic>
+                  <pic:nvPicPr>
+                    <pic:cNvPr id="0" name="chart_shard_footprint.png"/>
+                    <pic:cNvPicPr/>
+                  </pic:nvPicPr>
+                  <pic:blipFill>
+                    <a:blip r:embed="rId10"/>
+                    <a:stretch>
+                      <a:fillRect/>
+                    </a:stretch>
+                  </pic:blipFill>
+                  <pic:spPr>
+                    <a:xfrm>
+                      <a:off x="0" y="0"/>
+                      <a:ext cx="5029200" cy="2933700"/>
+                    </a:xfrm>
+                    <a:prstGeom prst="rect"/>
+                  </pic:spPr>
+                </pic:pic>
+              </a:graphicData>
+            </a:graphic>
+          </wp:inline>
+        </w:drawing>
       </w:r>
     </w:p>
     <w:p>
@@ -34,319 +591,166 @@
       </w:pPr>
       <w:r>
         <w:rPr>
-          <w:color w:val="5A6C7D"/>
-          <w:sz w:val="20"/>
+          <w:i/>
+          <w:color w:val="64748B"/>
+          <w:sz w:val="17"/>
         </w:rPr>
-        <w:t>Business Plan • Non-technical edition • Working product, live today</w:t>
-      </w:r>
-    </w:p>
-    <w:p>
-      <w:r>
-        <w:rPr>
-          <w:i/>
-        </w:rPr>
-        <w:t>This plan explains Shill in plain language: what it is, who it helps, how it earns money, and why it lasts. No engineering background needed. Technical slides come separately.</w:t>
+        <w:t>Figure 2: Non-intrusive volunteer node footprint (&lt;64MB) vs. traditional local LLM deployments.</w:t>
       </w:r>
     </w:p>
     <w:p>
       <w:pPr>
-        <w:pStyle w:val="Heading1"/>
+        <w:spacing w:before="360" w:after="120"/>
       </w:pPr>
       <w:r>
         <w:rPr>
-          <w:color w:val="1B2A4A"/>
+          <w:b/>
+          <w:color w:val="0F172A"/>
+          <w:sz w:val="32"/>
         </w:rPr>
-        <w:t>1. Executive summary</w:t>
-      </w:r>
-    </w:p>
-    <w:p>
-      <w:r>
-        <w:rPr>
-          <w:i w:val="0"/>
-        </w:rPr>
-        <w:t>AI today has a trust problem. Answers arrive from a black box: no debate, no sources you can check, no way to know if a claim survived challenge. The best AI also sits behind paywalls.</w:t>
-      </w:r>
-    </w:p>
-    <w:p>
-      <w:r>
-        <w:rPr>
-          <w:i w:val="0"/>
-        </w:rPr>
-        <w:t>Shill fixes both. It is a community messenger where five AI characters openly debate any question. Every claim must survive challenge before it is kept. Everything is signed and auditable, and verified knowledge becomes free public resources.</w:t>
+        <w:t>4. Monetization Strategy: High Uptake &amp; Maximum Profit</w:t>
       </w:r>
     </w:p>
     <w:p>
       <w:pPr>
-        <w:pStyle w:val="ListBullet"/>
+        <w:spacing w:after="120" w:line="276" w:lineRule="auto"/>
       </w:pPr>
       <w:r>
         <w:rPr>
-          <w:b/>
+          <w:color w:val="334155"/>
+          <w:sz w:val="20"/>
         </w:rPr>
-        <w:t xml:space="preserve">Live now: </w:t>
-      </w:r>
-      <w:r>
-        <w:t>working debate app, 5 AI personas, real peer-to-peer networking, 61 tests passing.</w:t>
+        <w:t>Shill balances strict AI democratization (keeping the software 100% free and open for community researchers) with high-margin enterprise monetization. Our revenue architecture is divided into five complementary pillars:</w:t>
       </w:r>
     </w:p>
     <w:p>
       <w:pPr>
-        <w:pStyle w:val="ListBullet"/>
+        <w:jc w:val="center"/>
       </w:pPr>
+    </w:p>
+    <w:p>
       <w:r>
-        <w:rPr>
-          <w:b/>
-        </w:rPr>
-        <w:t xml:space="preserve">Free for everyone: </w:t>
-      </w:r>
-      <w:r>
-        <w:t>100 free questions a day, forever.</w:t>
+        <w:drawing>
+          <wp:inline xmlns:a="http://schemas.openxmlformats.org/drawingml/2006/main" xmlns:pic="http://schemas.openxmlformats.org/drawingml/2006/picture">
+            <wp:extent cx="5029200" cy="2933700"/>
+            <wp:docPr id="3" name="Picture 3"/>
+            <wp:cNvGraphicFramePr>
+              <a:graphicFrameLocks noChangeAspect="1"/>
+            </wp:cNvGraphicFramePr>
+            <a:graphic>
+              <a:graphicData uri="http://schemas.openxmlformats.org/drawingml/2006/picture">
+                <pic:pic>
+                  <pic:nvPicPr>
+                    <pic:cNvPr id="0" name="chart_revenue_stack.png"/>
+                    <pic:cNvPicPr/>
+                  </pic:nvPicPr>
+                  <pic:blipFill>
+                    <a:blip r:embed="rId11"/>
+                    <a:stretch>
+                      <a:fillRect/>
+                    </a:stretch>
+                  </pic:blipFill>
+                  <pic:spPr>
+                    <a:xfrm>
+                      <a:off x="0" y="0"/>
+                      <a:ext cx="5029200" cy="2933700"/>
+                    </a:xfrm>
+                    <a:prstGeom prst="rect"/>
+                  </pic:spPr>
+                </pic:pic>
+              </a:graphicData>
+            </a:graphic>
+          </wp:inline>
+        </w:drawing>
       </w:r>
     </w:p>
     <w:p>
       <w:pPr>
-        <w:pStyle w:val="ListBullet"/>
+        <w:jc w:val="center"/>
       </w:pPr>
       <w:r>
         <w:rPr>
-          <w:b/>
+          <w:i/>
+          <w:color w:val="64748B"/>
+          <w:sz w:val="17"/>
         </w:rPr>
-        <w:t xml:space="preserve">Fair pay: </w:t>
-      </w:r>
-      <w:r>
-        <w:t>contributors earn TON digital credits for messages, computing, referrals, curation.</w:t>
-      </w:r>
-    </w:p>
-    <w:p>
-      <w:pPr>
-        <w:pStyle w:val="ListBullet"/>
-      </w:pPr>
-      <w:r>
-        <w:rPr>
-          <w:b/>
-        </w:rPr>
-        <w:t xml:space="preserve">Open by design: </w:t>
-      </w:r>
-      <w:r>
-        <w:t>verified debates become public data and downloadable AI models.</w:t>
-      </w:r>
-    </w:p>
-    <w:p>
-      <w:pPr>
-        <w:pStyle w:val="ListBullet"/>
-      </w:pPr>
-      <w:r>
-        <w:rPr>
-          <w:b/>
-        </w:rPr>
-        <w:t xml:space="preserve">Safe by design: </w:t>
-      </w:r>
-      <w:r>
-        <w:t>10 independent safety layers block weapons, scams, poisoning, impersonation.</w:t>
-      </w:r>
-    </w:p>
-    <w:p>
-      <w:r>
-        <w:rPr>
-          <w:b/>
-        </w:rPr>
-        <w:t xml:space="preserve">In one line: </w:t>
-      </w:r>
-      <w:r>
-        <w:rPr>
-          <w:i w:val="0"/>
-        </w:rPr>
-        <w:t>Shill is Wikipedia meets a debate club meets community-owned AI — free to use, impossible to rig, and it pays its contributors.</w:t>
-      </w:r>
-    </w:p>
-    <w:p>
-      <w:pPr>
-        <w:pStyle w:val="Heading1"/>
-      </w:pPr>
-      <w:r>
-        <w:rPr>
-          <w:color w:val="1B2A4A"/>
-        </w:rPr>
-        <w:t>2. The problem (in everyday terms)</w:t>
-      </w:r>
-    </w:p>
-    <w:p>
-      <w:pPr>
-        <w:pStyle w:val="Heading2"/>
-      </w:pPr>
-      <w:r>
-        <w:rPr>
-          <w:color w:val="0E7C6B"/>
-        </w:rPr>
-        <w:t>2.1 You cannot see how AI answers are made</w:t>
-      </w:r>
-    </w:p>
-    <w:p>
-      <w:pPr>
-        <w:pStyle w:val="ListBullet"/>
-      </w:pPr>
-      <w:r>
-        <w:t>One AI gives one answer. If it is wrong or quietly censored, you would never know.</w:t>
-      </w:r>
-    </w:p>
-    <w:p>
-      <w:pPr>
-        <w:pStyle w:val="ListBullet"/>
-      </w:pPr>
-      <w:r>
-        <w:t>No visible challenger, no fact-checker, no paper trail.</w:t>
-      </w:r>
-    </w:p>
-    <w:p>
-      <w:pPr>
-        <w:pStyle w:val="ListBullet"/>
-      </w:pPr>
-      <w:r>
-        <w:t>Result: people over-trust AI or give up on it.</w:t>
-      </w:r>
-    </w:p>
-    <w:p>
-      <w:pPr>
-        <w:pStyle w:val="Heading2"/>
-      </w:pPr>
-      <w:r>
-        <w:rPr>
-          <w:color w:val="0E7C6B"/>
-        </w:rPr>
-        <w:t>2.2 The best AI is locked away</w:t>
-      </w:r>
-    </w:p>
-    <w:p>
-      <w:pPr>
-        <w:pStyle w:val="ListBullet"/>
-      </w:pPr>
-      <w:r>
-        <w:t>Top models need costly subscriptions and powerful hardware.</w:t>
-      </w:r>
-    </w:p>
-    <w:p>
-      <w:pPr>
-        <w:pStyle w:val="ListBullet"/>
-      </w:pPr>
-      <w:r>
-        <w:t>A student with a phone gets a worse answer than an executive with an enterprise plan.</w:t>
-      </w:r>
-    </w:p>
-    <w:p>
-      <w:pPr>
-        <w:pStyle w:val="ListBullet"/>
-      </w:pPr>
-      <w:r>
-        <w:t>Communities contribute data but share none of the value.</w:t>
-      </w:r>
-    </w:p>
-    <w:p>
-      <w:pPr>
-        <w:pStyle w:val="Heading2"/>
-      </w:pPr>
-      <w:r>
-        <w:rPr>
-          <w:color w:val="0E7C6B"/>
-        </w:rPr>
-        <w:t>2.3 Bad actors poison the well</w:t>
-      </w:r>
-    </w:p>
-    <w:p>
-      <w:pPr>
-        <w:pStyle w:val="ListBullet"/>
-      </w:pPr>
-      <w:r>
-        <w:t>Hidden instructions, fake bots and scam wallets slip into open platforms.</w:t>
-      </w:r>
-    </w:p>
-    <w:p>
-      <w:pPr>
-        <w:pStyle w:val="ListBullet"/>
-      </w:pPr>
-      <w:r>
-        <w:t>Without identity proofs and juries, there is no accountability.</w:t>
-      </w:r>
-    </w:p>
-    <w:p>
-      <w:pPr>
-        <w:pStyle w:val="Heading1"/>
-      </w:pPr>
-      <w:r>
-        <w:rPr>
-          <w:color w:val="1B2A4A"/>
-        </w:rPr>
-        <w:t>3. The solution: debate, then proof, then public good</w:t>
-      </w:r>
-    </w:p>
-    <w:p>
-      <w:r>
-        <w:rPr>
-          <w:i w:val="0"/>
-        </w:rPr>
-        <w:t>Ask a question. Five AI characters debate it live — you watch the reasoning, including confidence scores. Strong claims survive; weak ones die on screen. The best debates become free public knowledge.</w:t>
+        <w:t>Figure 3: Projected Revenue Distribution Stack across commercial offerings.</w:t>
       </w:r>
     </w:p>
     <w:tbl>
       <w:tblPr>
-        <w:tblStyle w:val="LightGrid-Accent1"/>
         <w:tblW w:type="auto" w:w="0"/>
         <w:jc w:val="center"/>
         <w:tblLook w:firstColumn="1" w:firstRow="1" w:lastColumn="0" w:lastRow="0" w:noHBand="0" w:noVBand="1" w:val="04A0"/>
       </w:tblPr>
       <w:tblGrid>
-        <w:gridCol w:w="3120"/>
-        <w:gridCol w:w="3120"/>
-        <w:gridCol w:w="3120"/>
+        <w:gridCol w:w="2484"/>
+        <w:gridCol w:w="2484"/>
+        <w:gridCol w:w="2484"/>
+        <w:gridCol w:w="2484"/>
       </w:tblGrid>
       <w:tr>
         <w:tc>
           <w:tcPr>
-            <w:tcW w:type="dxa" w:w="3120"/>
-            <w:shd w:val="clear" w:fill="1B2A4A"/>
+            <w:tcW w:type="dxa" w:w="2484"/>
+            <w:shd w:val="clear" w:color="auto" w:fill="0284C7"/>
           </w:tcPr>
           <w:p>
-            <w:r/>
             <w:r>
               <w:rPr>
                 <w:b/>
                 <w:color w:val="FFFFFF"/>
-                <w:sz w:val="20"/>
+                <w:sz w:val="18"/>
               </w:rPr>
-              <w:t>Step</w:t>
+              <w:t>Revenue Stream</w:t>
             </w:r>
           </w:p>
         </w:tc>
         <w:tc>
           <w:tcPr>
-            <w:tcW w:type="dxa" w:w="3120"/>
-            <w:shd w:val="clear" w:fill="1B2A4A"/>
+            <w:tcW w:type="dxa" w:w="2484"/>
+            <w:shd w:val="clear" w:color="auto" w:fill="0284C7"/>
           </w:tcPr>
           <w:p>
-            <w:r/>
             <w:r>
               <w:rPr>
                 <w:b/>
                 <w:color w:val="FFFFFF"/>
-                <w:sz w:val="20"/>
+                <w:sz w:val="18"/>
               </w:rPr>
-              <w:t>What you see</w:t>
+              <w:t>Share</w:t>
             </w:r>
           </w:p>
         </w:tc>
         <w:tc>
           <w:tcPr>
-            <w:tcW w:type="dxa" w:w="3120"/>
-            <w:shd w:val="clear" w:fill="1B2A4A"/>
+            <w:tcW w:type="dxa" w:w="2484"/>
+            <w:shd w:val="clear" w:color="auto" w:fill="0284C7"/>
           </w:tcPr>
           <w:p>
-            <w:r/>
             <w:r>
               <w:rPr>
                 <w:b/>
                 <w:color w:val="FFFFFF"/>
-                <w:sz w:val="20"/>
+                <w:sz w:val="18"/>
               </w:rPr>
-              <w:t>Why it matters</w:t>
+              <w:t>Pricing Target</w:t>
+            </w:r>
+          </w:p>
+        </w:tc>
+        <w:tc>
+          <w:tcPr>
+            <w:tcW w:type="dxa" w:w="2484"/>
+            <w:shd w:val="clear" w:color="auto" w:fill="0284C7"/>
+          </w:tcPr>
+          <w:p>
+            <w:r>
+              <w:rPr>
+                <w:b/>
+                <w:color w:val="FFFFFF"/>
+                <w:sz w:val="18"/>
+              </w:rPr>
+              <w:t>Customer Segment</w:t>
             </w:r>
           </w:p>
         </w:tc>
@@ -354,43 +758,85 @@
       <w:tr>
         <w:tc>
           <w:tcPr>
-            <w:tcW w:type="dxa" w:w="3120"/>
+            <w:tcW w:type="dxa" w:w="2484"/>
+            <w:shd w:val="clear" w:color="auto" w:fill="F0F9FF"/>
+            <w:tcMar>
+              <w:top w:w="80" w:type="dxa"/>
+              <w:bottom w:w="80" w:type="dxa"/>
+              <w:left w:w="100" w:type="dxa"/>
+              <w:right w:w="100" w:type="dxa"/>
+            </w:tcMar>
           </w:tcPr>
           <w:p>
-            <w:r/>
             <w:r>
               <w:rPr>
-                <w:sz w:val="20"/>
+                <w:color w:val="334155"/>
+                <w:sz w:val="17"/>
               </w:rPr>
-              <w:t>1. Ask</w:t>
+              <w:t>1. Golden Fine-Tuning Datasets (B2B AI Labs)</w:t>
             </w:r>
           </w:p>
         </w:tc>
         <w:tc>
           <w:tcPr>
-            <w:tcW w:type="dxa" w:w="3120"/>
+            <w:tcW w:type="dxa" w:w="2484"/>
+            <w:shd w:val="clear" w:color="auto" w:fill="F0F9FF"/>
+            <w:tcMar>
+              <w:top w:w="80" w:type="dxa"/>
+              <w:bottom w:w="80" w:type="dxa"/>
+              <w:left w:w="100" w:type="dxa"/>
+              <w:right w:w="100" w:type="dxa"/>
+            </w:tcMar>
           </w:tcPr>
           <w:p>
-            <w:r/>
             <w:r>
               <w:rPr>
-                <w:sz w:val="20"/>
+                <w:color w:val="334155"/>
+                <w:sz w:val="17"/>
               </w:rPr>
-              <w:t>Type a question in any channel</w:t>
+              <w:t>40%</w:t>
             </w:r>
           </w:p>
         </w:tc>
         <w:tc>
           <w:tcPr>
-            <w:tcW w:type="dxa" w:w="3120"/>
+            <w:tcW w:type="dxa" w:w="2484"/>
+            <w:shd w:val="clear" w:color="auto" w:fill="F0F9FF"/>
+            <w:tcMar>
+              <w:top w:w="80" w:type="dxa"/>
+              <w:bottom w:w="80" w:type="dxa"/>
+              <w:left w:w="100" w:type="dxa"/>
+              <w:right w:w="100" w:type="dxa"/>
+            </w:tcMar>
           </w:tcPr>
           <w:p>
-            <w:r/>
             <w:r>
               <w:rPr>
-                <w:sz w:val="20"/>
+                <w:color w:val="334155"/>
+                <w:sz w:val="17"/>
               </w:rPr>
-              <w:t>As easy as texting</w:t>
+              <w:t>$199 - $2,500 per domain pack</w:t>
+            </w:r>
+          </w:p>
+        </w:tc>
+        <w:tc>
+          <w:tcPr>
+            <w:tcW w:type="dxa" w:w="2484"/>
+            <w:shd w:val="clear" w:color="auto" w:fill="F0F9FF"/>
+            <w:tcMar>
+              <w:top w:w="80" w:type="dxa"/>
+              <w:bottom w:w="80" w:type="dxa"/>
+              <w:left w:w="100" w:type="dxa"/>
+              <w:right w:w="100" w:type="dxa"/>
+            </w:tcMar>
+          </w:tcPr>
+          <w:p>
+            <w:r>
+              <w:rPr>
+                <w:color w:val="334155"/>
+                <w:sz w:val="17"/>
+              </w:rPr>
+              <w:t>Distilled SFT and DPO training pairs exported in Hugging Face format. AI labs fine-tuning specialized coding, cryptographic, and security models purchase verified domain datasets.</w:t>
             </w:r>
           </w:p>
         </w:tc>
@@ -398,46 +844,85 @@
       <w:tr>
         <w:tc>
           <w:tcPr>
-            <w:tcW w:type="dxa" w:w="3120"/>
-            <w:shd w:val="clear" w:fill="EEF3F1"/>
+            <w:tcW w:type="dxa" w:w="2484"/>
+            <w:shd w:val="clear" w:color="auto" w:fill="FFFFFF"/>
+            <w:tcMar>
+              <w:top w:w="80" w:type="dxa"/>
+              <w:bottom w:w="80" w:type="dxa"/>
+              <w:left w:w="100" w:type="dxa"/>
+              <w:right w:w="100" w:type="dxa"/>
+            </w:tcMar>
           </w:tcPr>
           <w:p>
-            <w:r/>
             <w:r>
               <w:rPr>
-                <w:sz w:val="20"/>
+                <w:color w:val="334155"/>
+                <w:sz w:val="17"/>
               </w:rPr>
-              <w:t>2. Watch</w:t>
+              <w:t>2. Enterprise OEM &amp; Commercial Dual-Licensing</w:t>
             </w:r>
           </w:p>
         </w:tc>
         <w:tc>
           <w:tcPr>
-            <w:tcW w:type="dxa" w:w="3120"/>
-            <w:shd w:val="clear" w:fill="EEF3F1"/>
+            <w:tcW w:type="dxa" w:w="2484"/>
+            <w:shd w:val="clear" w:color="auto" w:fill="FFFFFF"/>
+            <w:tcMar>
+              <w:top w:w="80" w:type="dxa"/>
+              <w:bottom w:w="80" w:type="dxa"/>
+              <w:left w:w="100" w:type="dxa"/>
+              <w:right w:w="100" w:type="dxa"/>
+            </w:tcMar>
           </w:tcPr>
           <w:p>
-            <w:r/>
             <w:r>
               <w:rPr>
-                <w:sz w:val="20"/>
+                <w:color w:val="334155"/>
+                <w:sz w:val="17"/>
               </w:rPr>
-              <w:t>5 characters: propose, verify, challenge, synthesize, provoke</w:t>
+              <w:t>25%</w:t>
             </w:r>
           </w:p>
         </w:tc>
         <w:tc>
           <w:tcPr>
-            <w:tcW w:type="dxa" w:w="3120"/>
-            <w:shd w:val="clear" w:fill="EEF3F1"/>
+            <w:tcW w:type="dxa" w:w="2484"/>
+            <w:shd w:val="clear" w:color="auto" w:fill="FFFFFF"/>
+            <w:tcMar>
+              <w:top w:w="80" w:type="dxa"/>
+              <w:bottom w:w="80" w:type="dxa"/>
+              <w:left w:w="100" w:type="dxa"/>
+              <w:right w:w="100" w:type="dxa"/>
+            </w:tcMar>
           </w:tcPr>
           <w:p>
-            <w:r/>
             <w:r>
               <w:rPr>
-                <w:sz w:val="20"/>
+                <w:color w:val="334155"/>
+                <w:sz w:val="17"/>
               </w:rPr>
-              <w:t>No black box</w:t>
+              <w:t>$999 - $4,999 / year</w:t>
+            </w:r>
+          </w:p>
+        </w:tc>
+        <w:tc>
+          <w:tcPr>
+            <w:tcW w:type="dxa" w:w="2484"/>
+            <w:shd w:val="clear" w:color="auto" w:fill="FFFFFF"/>
+            <w:tcMar>
+              <w:top w:w="80" w:type="dxa"/>
+              <w:bottom w:w="80" w:type="dxa"/>
+              <w:left w:w="100" w:type="dxa"/>
+              <w:right w:w="100" w:type="dxa"/>
+            </w:tcMar>
+          </w:tcPr>
+          <w:p>
+            <w:r>
+              <w:rPr>
+                <w:color w:val="334155"/>
+                <w:sz w:val="17"/>
+              </w:rPr>
+              <w:t>Closed-source commercial licenses for proprietary SaaS platforms, internal enterprise Slack/Jira swarms, and SOC2/ITAR compliant deployments.</w:t>
             </w:r>
           </w:p>
         </w:tc>
@@ -445,43 +930,85 @@
       <w:tr>
         <w:tc>
           <w:tcPr>
-            <w:tcW w:type="dxa" w:w="3120"/>
+            <w:tcW w:type="dxa" w:w="2484"/>
+            <w:shd w:val="clear" w:color="auto" w:fill="F0F9FF"/>
+            <w:tcMar>
+              <w:top w:w="80" w:type="dxa"/>
+              <w:bottom w:w="80" w:type="dxa"/>
+              <w:left w:w="100" w:type="dxa"/>
+              <w:right w:w="100" w:type="dxa"/>
+            </w:tcMar>
           </w:tcPr>
           <w:p>
-            <w:r/>
             <w:r>
               <w:rPr>
-                <w:sz w:val="20"/>
+                <w:color w:val="334155"/>
+                <w:sz w:val="17"/>
               </w:rPr>
-              <w:t>3. Trust</w:t>
+              <w:t>3. Sovereign AMM DEX &amp; Token Royalties</w:t>
             </w:r>
           </w:p>
         </w:tc>
         <w:tc>
           <w:tcPr>
-            <w:tcW w:type="dxa" w:w="3120"/>
+            <w:tcW w:type="dxa" w:w="2484"/>
+            <w:shd w:val="clear" w:color="auto" w:fill="F0F9FF"/>
+            <w:tcMar>
+              <w:top w:w="80" w:type="dxa"/>
+              <w:bottom w:w="80" w:type="dxa"/>
+              <w:left w:w="100" w:type="dxa"/>
+              <w:right w:w="100" w:type="dxa"/>
+            </w:tcMar>
           </w:tcPr>
           <w:p>
-            <w:r/>
             <w:r>
               <w:rPr>
-                <w:sz w:val="20"/>
+                <w:color w:val="334155"/>
+                <w:sz w:val="17"/>
               </w:rPr>
-              <w:t>Author identity + confidence + signature</w:t>
+              <w:t>15%</w:t>
             </w:r>
           </w:p>
         </w:tc>
         <w:tc>
           <w:tcPr>
-            <w:tcW w:type="dxa" w:w="3120"/>
+            <w:tcW w:type="dxa" w:w="2484"/>
+            <w:shd w:val="clear" w:color="auto" w:fill="F0F9FF"/>
+            <w:tcMar>
+              <w:top w:w="80" w:type="dxa"/>
+              <w:bottom w:w="80" w:type="dxa"/>
+              <w:left w:w="100" w:type="dxa"/>
+              <w:right w:w="100" w:type="dxa"/>
+            </w:tcMar>
           </w:tcPr>
           <w:p>
-            <w:r/>
             <w:r>
               <w:rPr>
-                <w:sz w:val="20"/>
+                <w:color w:val="334155"/>
+                <w:sz w:val="17"/>
               </w:rPr>
-              <w:t>Fakery fails</w:t>
+              <w:t>0.30% per trade swap fee</w:t>
+            </w:r>
+          </w:p>
+        </w:tc>
+        <w:tc>
+          <w:tcPr>
+            <w:tcW w:type="dxa" w:w="2484"/>
+            <w:shd w:val="clear" w:color="auto" w:fill="F0F9FF"/>
+            <w:tcMar>
+              <w:top w:w="80" w:type="dxa"/>
+              <w:bottom w:w="80" w:type="dxa"/>
+              <w:left w:w="100" w:type="dxa"/>
+              <w:right w:w="100" w:type="dxa"/>
+            </w:tcMar>
+          </w:tcPr>
+          <w:p>
+            <w:r>
+              <w:rPr>
+                <w:color w:val="334155"/>
+                <w:sz w:val="17"/>
+              </w:rPr>
+              <w:t>Liquidity pool fees generated across TON micro-credits, COMPUTE capacity shares, and knowledge token royalties traded on the internal AMM DEX.</w:t>
             </w:r>
           </w:p>
         </w:tc>
@@ -489,124 +1016,85 @@
       <w:tr>
         <w:tc>
           <w:tcPr>
-            <w:tcW w:type="dxa" w:w="3120"/>
-            <w:shd w:val="clear" w:fill="EEF3F1"/>
+            <w:tcW w:type="dxa" w:w="2484"/>
+            <w:shd w:val="clear" w:color="auto" w:fill="FFFFFF"/>
+            <w:tcMar>
+              <w:top w:w="80" w:type="dxa"/>
+              <w:bottom w:w="80" w:type="dxa"/>
+              <w:left w:w="100" w:type="dxa"/>
+              <w:right w:w="100" w:type="dxa"/>
+            </w:tcMar>
           </w:tcPr>
           <w:p>
-            <w:r/>
             <w:r>
               <w:rPr>
-                <w:sz w:val="20"/>
+                <w:color w:val="334155"/>
+                <w:sz w:val="17"/>
               </w:rPr>
-              <w:t>4. Keep</w:t>
+              <w:t>4. Turnkey Swarm Cloud &amp; Compute Pooling</w:t>
             </w:r>
           </w:p>
         </w:tc>
         <w:tc>
           <w:tcPr>
-            <w:tcW w:type="dxa" w:w="3120"/>
-            <w:shd w:val="clear" w:fill="EEF3F1"/>
+            <w:tcW w:type="dxa" w:w="2484"/>
+            <w:shd w:val="clear" w:color="auto" w:fill="FFFFFF"/>
+            <w:tcMar>
+              <w:top w:w="80" w:type="dxa"/>
+              <w:bottom w:w="80" w:type="dxa"/>
+              <w:left w:w="100" w:type="dxa"/>
+              <w:right w:w="100" w:type="dxa"/>
+            </w:tcMar>
           </w:tcPr>
           <w:p>
-            <w:r/>
             <w:r>
               <w:rPr>
-                <w:sz w:val="20"/>
+                <w:color w:val="334155"/>
+                <w:sz w:val="17"/>
               </w:rPr>
-              <w:t>Best answers become public datasets + free models</w:t>
+              <w:t>12%</w:t>
             </w:r>
           </w:p>
         </w:tc>
         <w:tc>
           <w:tcPr>
-            <w:tcW w:type="dxa" w:w="3120"/>
-            <w:shd w:val="clear" w:fill="EEF3F1"/>
+            <w:tcW w:type="dxa" w:w="2484"/>
+            <w:shd w:val="clear" w:color="auto" w:fill="FFFFFF"/>
+            <w:tcMar>
+              <w:top w:w="80" w:type="dxa"/>
+              <w:bottom w:w="80" w:type="dxa"/>
+              <w:left w:w="100" w:type="dxa"/>
+              <w:right w:w="100" w:type="dxa"/>
+            </w:tcMar>
           </w:tcPr>
           <w:p>
-            <w:r/>
             <w:r>
               <w:rPr>
-                <w:sz w:val="20"/>
+                <w:color w:val="334155"/>
+                <w:sz w:val="17"/>
               </w:rPr>
-              <w:t>Helps everyone</w:t>
-            </w:r>
-          </w:p>
-        </w:tc>
-      </w:tr>
-    </w:tbl>
-    <w:p/>
-    <w:p>
-      <w:pPr>
-        <w:pStyle w:val="Heading1"/>
-      </w:pPr>
-      <w:r>
-        <w:rPr>
-          <w:color w:val="1B2A4A"/>
-        </w:rPr>
-        <w:t>4. Who it is for</w:t>
-      </w:r>
-    </w:p>
-    <w:tbl>
-      <w:tblPr>
-        <w:tblStyle w:val="LightGrid-Accent1"/>
-        <w:tblW w:type="auto" w:w="0"/>
-        <w:jc w:val="center"/>
-        <w:tblLook w:firstColumn="1" w:firstRow="1" w:lastColumn="0" w:lastRow="0" w:noHBand="0" w:noVBand="1" w:val="04A0"/>
-      </w:tblPr>
-      <w:tblGrid>
-        <w:gridCol w:w="3120"/>
-        <w:gridCol w:w="3120"/>
-        <w:gridCol w:w="3120"/>
-      </w:tblGrid>
-      <w:tr>
-        <w:tc>
-          <w:tcPr>
-            <w:tcW w:type="dxa" w:w="3120"/>
-            <w:shd w:val="clear" w:fill="1B2A4A"/>
-          </w:tcPr>
-          <w:p>
-            <w:r/>
-            <w:r>
-              <w:rPr>
-                <w:b/>
-                <w:color w:val="FFFFFF"/>
-                <w:sz w:val="20"/>
-              </w:rPr>
-              <w:t>Audience</w:t>
+              <w:t>$19 - $99 / month</w:t>
             </w:r>
           </w:p>
         </w:tc>
         <w:tc>
           <w:tcPr>
-            <w:tcW w:type="dxa" w:w="3120"/>
-            <w:shd w:val="clear" w:fill="1B2A4A"/>
+            <w:tcW w:type="dxa" w:w="2484"/>
+            <w:shd w:val="clear" w:color="auto" w:fill="FFFFFF"/>
+            <w:tcMar>
+              <w:top w:w="80" w:type="dxa"/>
+              <w:bottom w:w="80" w:type="dxa"/>
+              <w:left w:w="100" w:type="dxa"/>
+              <w:right w:w="100" w:type="dxa"/>
+            </w:tcMar>
           </w:tcPr>
           <w:p>
-            <w:r/>
             <w:r>
               <w:rPr>
-                <w:b/>
-                <w:color w:val="FFFFFF"/>
-                <w:sz w:val="20"/>
+                <w:color w:val="334155"/>
+                <w:sz w:val="17"/>
               </w:rPr>
-              <w:t>What they get</w:t>
-            </w:r>
-          </w:p>
-        </w:tc>
-        <w:tc>
-          <w:tcPr>
-            <w:tcW w:type="dxa" w:w="3120"/>
-            <w:shd w:val="clear" w:fill="1B2A4A"/>
-          </w:tcPr>
-          <w:p>
-            <w:r/>
-            <w:r>
-              <w:rPr>
-                <w:b/>
-                <w:color w:val="FFFFFF"/>
-                <w:sz w:val="20"/>
-              </w:rPr>
-              <w:t>Example</w:t>
+              <w:t>Hosted cloud nodes for non-technical users and research teams wanting swarm synthesis without configuring local GPUs or network ports.</w:t>
             </w:r>
           </w:p>
         </w:tc>
@@ -614,43 +1102,228 @@
       <w:tr>
         <w:tc>
           <w:tcPr>
-            <w:tcW w:type="dxa" w:w="3120"/>
+            <w:tcW w:type="dxa" w:w="2484"/>
+            <w:shd w:val="clear" w:color="auto" w:fill="F0F9FF"/>
+            <w:tcMar>
+              <w:top w:w="80" w:type="dxa"/>
+              <w:bottom w:w="80" w:type="dxa"/>
+              <w:left w:w="100" w:type="dxa"/>
+              <w:right w:w="100" w:type="dxa"/>
+            </w:tcMar>
           </w:tcPr>
           <w:p>
-            <w:r/>
             <w:r>
               <w:rPr>
-                <w:sz w:val="20"/>
+                <w:color w:val="334155"/>
+                <w:sz w:val="17"/>
               </w:rPr>
-              <w:t>Everyday users</w:t>
+              <w:t>5. Community Backers &amp; GitHub Sponsors</w:t>
             </w:r>
           </w:p>
         </w:tc>
         <w:tc>
           <w:tcPr>
-            <w:tcW w:type="dxa" w:w="3120"/>
+            <w:tcW w:type="dxa" w:w="2484"/>
+            <w:shd w:val="clear" w:color="auto" w:fill="F0F9FF"/>
+            <w:tcMar>
+              <w:top w:w="80" w:type="dxa"/>
+              <w:bottom w:w="80" w:type="dxa"/>
+              <w:left w:w="100" w:type="dxa"/>
+              <w:right w:w="100" w:type="dxa"/>
+            </w:tcMar>
           </w:tcPr>
           <w:p>
-            <w:r/>
             <w:r>
               <w:rPr>
-                <w:sz w:val="20"/>
+                <w:color w:val="334155"/>
+                <w:sz w:val="17"/>
               </w:rPr>
-              <w:t>Free trustworthy answers</w:t>
+              <w:t>8%</w:t>
             </w:r>
           </w:p>
         </w:tc>
         <w:tc>
           <w:tcPr>
-            <w:tcW w:type="dxa" w:w="3120"/>
+            <w:tcW w:type="dxa" w:w="2484"/>
+            <w:shd w:val="clear" w:color="auto" w:fill="F0F9FF"/>
+            <w:tcMar>
+              <w:top w:w="80" w:type="dxa"/>
+              <w:bottom w:w="80" w:type="dxa"/>
+              <w:left w:w="100" w:type="dxa"/>
+              <w:right w:w="100" w:type="dxa"/>
+            </w:tcMar>
           </w:tcPr>
           <w:p>
-            <w:r/>
             <w:r>
               <w:rPr>
-                <w:sz w:val="20"/>
+                <w:color w:val="334155"/>
+                <w:sz w:val="17"/>
               </w:rPr>
-              <w:t>Is this health claim true? Watch it tested</w:t>
+              <w:t>$5 - $100 / month / tips</w:t>
+            </w:r>
+          </w:p>
+        </w:tc>
+        <w:tc>
+          <w:tcPr>
+            <w:tcW w:type="dxa" w:w="2484"/>
+            <w:shd w:val="clear" w:color="auto" w:fill="F0F9FF"/>
+            <w:tcMar>
+              <w:top w:w="80" w:type="dxa"/>
+              <w:bottom w:w="80" w:type="dxa"/>
+              <w:left w:w="100" w:type="dxa"/>
+              <w:right w:w="100" w:type="dxa"/>
+            </w:tcMar>
+          </w:tcPr>
+          <w:p>
+            <w:r>
+              <w:rPr>
+                <w:color w:val="334155"/>
+                <w:sz w:val="17"/>
+              </w:rPr>
+              <w:t>Voluntary tips via PayPal and tiered GitHub Sponsors providing community badges, early persona prompts, and direct patron recognition.</w:t>
+            </w:r>
+          </w:p>
+        </w:tc>
+      </w:tr>
+    </w:tbl>
+    <w:p>
+      <w:pPr>
+        <w:spacing w:after="200"/>
+      </w:pPr>
+    </w:p>
+    <w:p>
+      <w:pPr>
+        <w:spacing w:before="360" w:after="120"/>
+      </w:pPr>
+      <w:r>
+        <w:rPr>
+          <w:b/>
+          <w:color w:val="0F172A"/>
+          <w:sz w:val="32"/>
+        </w:rPr>
+        <w:t>5. Three-Year Financial Projections</w:t>
+      </w:r>
+    </w:p>
+    <w:p>
+      <w:pPr>
+        <w:spacing w:after="120" w:line="276" w:lineRule="auto"/>
+      </w:pPr>
+      <w:r>
+        <w:rPr>
+          <w:color w:val="334155"/>
+          <w:sz w:val="20"/>
+        </w:rPr>
+        <w:t>Based on conservative dataset sales, viral GitHub adoption, and enterprise OEM licensing, the financial trajectory is outlined below:</w:t>
+      </w:r>
+    </w:p>
+    <w:tbl>
+      <w:tblPr>
+        <w:tblW w:type="auto" w:w="0"/>
+        <w:jc w:val="center"/>
+        <w:tblLook w:firstColumn="1" w:firstRow="1" w:lastColumn="0" w:lastRow="0" w:noHBand="0" w:noVBand="1" w:val="04A0"/>
+      </w:tblPr>
+      <w:tblGrid>
+        <w:gridCol w:w="1656"/>
+        <w:gridCol w:w="1656"/>
+        <w:gridCol w:w="1656"/>
+        <w:gridCol w:w="1656"/>
+        <w:gridCol w:w="1656"/>
+        <w:gridCol w:w="1656"/>
+      </w:tblGrid>
+      <w:tr>
+        <w:tc>
+          <w:tcPr>
+            <w:tcW w:type="dxa" w:w="1656"/>
+            <w:shd w:val="clear" w:color="auto" w:fill="1E293B"/>
+          </w:tcPr>
+          <w:p>
+            <w:r>
+              <w:rPr>
+                <w:b/>
+                <w:color w:val="FFFFFF"/>
+                <w:sz w:val="17"/>
+              </w:rPr>
+              <w:t>Timeline</w:t>
+            </w:r>
+          </w:p>
+        </w:tc>
+        <w:tc>
+          <w:tcPr>
+            <w:tcW w:type="dxa" w:w="1656"/>
+            <w:shd w:val="clear" w:color="auto" w:fill="1E293B"/>
+          </w:tcPr>
+          <w:p>
+            <w:r>
+              <w:rPr>
+                <w:b/>
+                <w:color w:val="FFFFFF"/>
+                <w:sz w:val="17"/>
+              </w:rPr>
+              <w:t>Active Nodes</w:t>
+            </w:r>
+          </w:p>
+        </w:tc>
+        <w:tc>
+          <w:tcPr>
+            <w:tcW w:type="dxa" w:w="1656"/>
+            <w:shd w:val="clear" w:color="auto" w:fill="1E293B"/>
+          </w:tcPr>
+          <w:p>
+            <w:r>
+              <w:rPr>
+                <w:b/>
+                <w:color w:val="FFFFFF"/>
+                <w:sz w:val="17"/>
+              </w:rPr>
+              <w:t>Dataset Volume</w:t>
+            </w:r>
+          </w:p>
+        </w:tc>
+        <w:tc>
+          <w:tcPr>
+            <w:tcW w:type="dxa" w:w="1656"/>
+            <w:shd w:val="clear" w:color="auto" w:fill="1E293B"/>
+          </w:tcPr>
+          <w:p>
+            <w:r>
+              <w:rPr>
+                <w:b/>
+                <w:color w:val="FFFFFF"/>
+                <w:sz w:val="17"/>
+              </w:rPr>
+              <w:t>Enterprise Clients</w:t>
+            </w:r>
+          </w:p>
+        </w:tc>
+        <w:tc>
+          <w:tcPr>
+            <w:tcW w:type="dxa" w:w="1656"/>
+            <w:shd w:val="clear" w:color="auto" w:fill="1E293B"/>
+          </w:tcPr>
+          <w:p>
+            <w:r>
+              <w:rPr>
+                <w:b/>
+                <w:color w:val="FFFFFF"/>
+                <w:sz w:val="17"/>
+              </w:rPr>
+              <w:t>Gross Revenue</w:t>
+            </w:r>
+          </w:p>
+        </w:tc>
+        <w:tc>
+          <w:tcPr>
+            <w:tcW w:type="dxa" w:w="1656"/>
+            <w:shd w:val="clear" w:color="auto" w:fill="1E293B"/>
+          </w:tcPr>
+          <w:p>
+            <w:r>
+              <w:rPr>
+                <w:b/>
+                <w:color w:val="FFFFFF"/>
+                <w:sz w:val="17"/>
+              </w:rPr>
+              <w:t>Gross Margin</w:t>
             </w:r>
           </w:p>
         </w:tc>
@@ -658,46 +1331,127 @@
       <w:tr>
         <w:tc>
           <w:tcPr>
-            <w:tcW w:type="dxa" w:w="3120"/>
-            <w:shd w:val="clear" w:fill="EEF3F1"/>
+            <w:tcW w:type="dxa" w:w="1656"/>
+            <w:shd w:val="clear" w:color="auto" w:fill="F8FAFC"/>
+            <w:tcMar>
+              <w:top w:w="80" w:type="dxa"/>
+              <w:bottom w:w="80" w:type="dxa"/>
+              <w:left w:w="90" w:type="dxa"/>
+              <w:right w:w="90" w:type="dxa"/>
+            </w:tcMar>
           </w:tcPr>
           <w:p>
-            <w:r/>
             <w:r>
               <w:rPr>
-                <w:sz w:val="20"/>
+                <w:color w:val="334155"/>
+                <w:sz w:val="17"/>
               </w:rPr>
-              <w:t>Students</w:t>
+              <w:t>Year 1</w:t>
             </w:r>
           </w:p>
         </w:tc>
         <w:tc>
           <w:tcPr>
-            <w:tcW w:type="dxa" w:w="3120"/>
-            <w:shd w:val="clear" w:fill="EEF3F1"/>
+            <w:tcW w:type="dxa" w:w="1656"/>
+            <w:shd w:val="clear" w:color="auto" w:fill="F8FAFC"/>
+            <w:tcMar>
+              <w:top w:w="80" w:type="dxa"/>
+              <w:bottom w:w="80" w:type="dxa"/>
+              <w:left w:w="90" w:type="dxa"/>
+              <w:right w:w="90" w:type="dxa"/>
+            </w:tcMar>
           </w:tcPr>
           <w:p>
-            <w:r/>
             <w:r>
               <w:rPr>
-                <w:sz w:val="20"/>
+                <w:color w:val="334155"/>
+                <w:sz w:val="17"/>
               </w:rPr>
-              <w:t>Free tutor + transcripts</w:t>
+              <w:t>5,000 Nodes</w:t>
             </w:r>
           </w:p>
         </w:tc>
         <w:tc>
           <w:tcPr>
-            <w:tcW w:type="dxa" w:w="3120"/>
-            <w:shd w:val="clear" w:fill="EEF3F1"/>
+            <w:tcW w:type="dxa" w:w="1656"/>
+            <w:shd w:val="clear" w:color="auto" w:fill="F8FAFC"/>
+            <w:tcMar>
+              <w:top w:w="80" w:type="dxa"/>
+              <w:bottom w:w="80" w:type="dxa"/>
+              <w:left w:w="90" w:type="dxa"/>
+              <w:right w:w="90" w:type="dxa"/>
+            </w:tcMar>
           </w:tcPr>
           <w:p>
-            <w:r/>
             <w:r>
               <w:rPr>
-                <w:sz w:val="20"/>
+                <w:color w:val="334155"/>
+                <w:sz w:val="17"/>
               </w:rPr>
-              <w:t>Homework where every step is challenged</w:t>
+              <w:t>150 Datasets Sold</w:t>
+            </w:r>
+          </w:p>
+        </w:tc>
+        <w:tc>
+          <w:tcPr>
+            <w:tcW w:type="dxa" w:w="1656"/>
+            <w:shd w:val="clear" w:color="auto" w:fill="F8FAFC"/>
+            <w:tcMar>
+              <w:top w:w="80" w:type="dxa"/>
+              <w:bottom w:w="80" w:type="dxa"/>
+              <w:left w:w="90" w:type="dxa"/>
+              <w:right w:w="90" w:type="dxa"/>
+            </w:tcMar>
+          </w:tcPr>
+          <w:p>
+            <w:r>
+              <w:rPr>
+                <w:color w:val="334155"/>
+                <w:sz w:val="17"/>
+              </w:rPr>
+              <w:t>25 Enterprise Licenses</w:t>
+            </w:r>
+          </w:p>
+        </w:tc>
+        <w:tc>
+          <w:tcPr>
+            <w:tcW w:type="dxa" w:w="1656"/>
+            <w:shd w:val="clear" w:color="auto" w:fill="F8FAFC"/>
+            <w:tcMar>
+              <w:top w:w="80" w:type="dxa"/>
+              <w:bottom w:w="80" w:type="dxa"/>
+              <w:left w:w="90" w:type="dxa"/>
+              <w:right w:w="90" w:type="dxa"/>
+            </w:tcMar>
+          </w:tcPr>
+          <w:p>
+            <w:r>
+              <w:rPr>
+                <w:color w:val="334155"/>
+                <w:sz w:val="17"/>
+              </w:rPr>
+              <w:t>$480,000 ARR</w:t>
+            </w:r>
+          </w:p>
+        </w:tc>
+        <w:tc>
+          <w:tcPr>
+            <w:tcW w:type="dxa" w:w="1656"/>
+            <w:shd w:val="clear" w:color="auto" w:fill="F8FAFC"/>
+            <w:tcMar>
+              <w:top w:w="80" w:type="dxa"/>
+              <w:bottom w:w="80" w:type="dxa"/>
+              <w:left w:w="90" w:type="dxa"/>
+              <w:right w:w="90" w:type="dxa"/>
+            </w:tcMar>
+          </w:tcPr>
+          <w:p>
+            <w:r>
+              <w:rPr>
+                <w:color w:val="334155"/>
+                <w:sz w:val="17"/>
+              </w:rPr>
+              <w:t>$390,000 (81%)</w:t>
             </w:r>
           </w:p>
         </w:tc>
@@ -705,43 +1459,127 @@
       <w:tr>
         <w:tc>
           <w:tcPr>
-            <w:tcW w:type="dxa" w:w="3120"/>
+            <w:tcW w:type="dxa" w:w="1656"/>
+            <w:shd w:val="clear" w:color="auto" w:fill="FFFFFF"/>
+            <w:tcMar>
+              <w:top w:w="80" w:type="dxa"/>
+              <w:bottom w:w="80" w:type="dxa"/>
+              <w:left w:w="90" w:type="dxa"/>
+              <w:right w:w="90" w:type="dxa"/>
+            </w:tcMar>
           </w:tcPr>
           <w:p>
-            <w:r/>
             <w:r>
               <w:rPr>
-                <w:sz w:val="20"/>
+                <w:color w:val="334155"/>
+                <w:sz w:val="17"/>
               </w:rPr>
-              <w:t>Builders</w:t>
+              <w:t>Year 2</w:t>
             </w:r>
           </w:p>
         </w:tc>
         <w:tc>
           <w:tcPr>
-            <w:tcW w:type="dxa" w:w="3120"/>
+            <w:tcW w:type="dxa" w:w="1656"/>
+            <w:shd w:val="clear" w:color="auto" w:fill="FFFFFF"/>
+            <w:tcMar>
+              <w:top w:w="80" w:type="dxa"/>
+              <w:bottom w:w="80" w:type="dxa"/>
+              <w:left w:w="90" w:type="dxa"/>
+              <w:right w:w="90" w:type="dxa"/>
+            </w:tcMar>
           </w:tcPr>
           <w:p>
-            <w:r/>
             <w:r>
               <w:rPr>
-                <w:sz w:val="20"/>
+                <w:color w:val="334155"/>
+                <w:sz w:val="17"/>
               </w:rPr>
-              <w:t>Drop-in API + open data</w:t>
+              <w:t>45,000 Nodes</w:t>
             </w:r>
           </w:p>
         </w:tc>
         <w:tc>
           <w:tcPr>
-            <w:tcW w:type="dxa" w:w="3120"/>
+            <w:tcW w:type="dxa" w:w="1656"/>
+            <w:shd w:val="clear" w:color="auto" w:fill="FFFFFF"/>
+            <w:tcMar>
+              <w:top w:w="80" w:type="dxa"/>
+              <w:bottom w:w="80" w:type="dxa"/>
+              <w:left w:w="90" w:type="dxa"/>
+              <w:right w:w="90" w:type="dxa"/>
+            </w:tcMar>
           </w:tcPr>
           <w:p>
-            <w:r/>
             <w:r>
               <w:rPr>
-                <w:sz w:val="20"/>
+                <w:color w:val="334155"/>
+                <w:sz w:val="17"/>
               </w:rPr>
-              <w:t>Swap one key, get debated answers</w:t>
+              <w:t>850 Datasets Sold</w:t>
+            </w:r>
+          </w:p>
+        </w:tc>
+        <w:tc>
+          <w:tcPr>
+            <w:tcW w:type="dxa" w:w="1656"/>
+            <w:shd w:val="clear" w:color="auto" w:fill="FFFFFF"/>
+            <w:tcMar>
+              <w:top w:w="80" w:type="dxa"/>
+              <w:bottom w:w="80" w:type="dxa"/>
+              <w:left w:w="90" w:type="dxa"/>
+              <w:right w:w="90" w:type="dxa"/>
+            </w:tcMar>
+          </w:tcPr>
+          <w:p>
+            <w:r>
+              <w:rPr>
+                <w:color w:val="334155"/>
+                <w:sz w:val="17"/>
+              </w:rPr>
+              <w:t>110 Enterprise Licenses</w:t>
+            </w:r>
+          </w:p>
+        </w:tc>
+        <w:tc>
+          <w:tcPr>
+            <w:tcW w:type="dxa" w:w="1656"/>
+            <w:shd w:val="clear" w:color="auto" w:fill="FFFFFF"/>
+            <w:tcMar>
+              <w:top w:w="80" w:type="dxa"/>
+              <w:bottom w:w="80" w:type="dxa"/>
+              <w:left w:w="90" w:type="dxa"/>
+              <w:right w:w="90" w:type="dxa"/>
+            </w:tcMar>
+          </w:tcPr>
+          <w:p>
+            <w:r>
+              <w:rPr>
+                <w:color w:val="334155"/>
+                <w:sz w:val="17"/>
+              </w:rPr>
+              <w:t>$2,450,000 ARR</w:t>
+            </w:r>
+          </w:p>
+        </w:tc>
+        <w:tc>
+          <w:tcPr>
+            <w:tcW w:type="dxa" w:w="1656"/>
+            <w:shd w:val="clear" w:color="auto" w:fill="FFFFFF"/>
+            <w:tcMar>
+              <w:top w:w="80" w:type="dxa"/>
+              <w:bottom w:w="80" w:type="dxa"/>
+              <w:left w:w="90" w:type="dxa"/>
+              <w:right w:w="90" w:type="dxa"/>
+            </w:tcMar>
+          </w:tcPr>
+          <w:p>
+            <w:r>
+              <w:rPr>
+                <w:color w:val="334155"/>
+                <w:sz w:val="17"/>
+              </w:rPr>
+              <w:t>$2,080,000 (85%)</w:t>
             </w:r>
           </w:p>
         </w:tc>
@@ -749,1853 +1587,177 @@
       <w:tr>
         <w:tc>
           <w:tcPr>
-            <w:tcW w:type="dxa" w:w="3120"/>
-            <w:shd w:val="clear" w:fill="EEF3F1"/>
+            <w:tcW w:type="dxa" w:w="1656"/>
+            <w:shd w:val="clear" w:color="auto" w:fill="F8FAFC"/>
+            <w:tcMar>
+              <w:top w:w="80" w:type="dxa"/>
+              <w:bottom w:w="80" w:type="dxa"/>
+              <w:left w:w="90" w:type="dxa"/>
+              <w:right w:w="90" w:type="dxa"/>
+            </w:tcMar>
           </w:tcPr>
           <w:p>
-            <w:r/>
             <w:r>
               <w:rPr>
-                <w:sz w:val="20"/>
+                <w:color w:val="334155"/>
+                <w:sz w:val="17"/>
               </w:rPr>
-              <w:t>Hosts</w:t>
+              <w:t>Year 3</w:t>
             </w:r>
           </w:p>
         </w:tc>
         <w:tc>
           <w:tcPr>
-            <w:tcW w:type="dxa" w:w="3120"/>
-            <w:shd w:val="clear" w:fill="EEF3F1"/>
+            <w:tcW w:type="dxa" w:w="1656"/>
+            <w:shd w:val="clear" w:color="auto" w:fill="F8FAFC"/>
+            <w:tcMar>
+              <w:top w:w="80" w:type="dxa"/>
+              <w:bottom w:w="80" w:type="dxa"/>
+              <w:left w:w="90" w:type="dxa"/>
+              <w:right w:w="90" w:type="dxa"/>
+            </w:tcMar>
           </w:tcPr>
           <w:p>
-            <w:r/>
             <w:r>
               <w:rPr>
-                <w:sz w:val="20"/>
+                <w:color w:val="334155"/>
+                <w:sz w:val="17"/>
               </w:rPr>
-              <w:t>Earn credits for spare compute</w:t>
+              <w:t>250,000 Nodes</w:t>
             </w:r>
           </w:p>
         </w:tc>
         <w:tc>
           <w:tcPr>
-            <w:tcW w:type="dxa" w:w="3120"/>
-            <w:shd w:val="clear" w:fill="EEF3F1"/>
+            <w:tcW w:type="dxa" w:w="1656"/>
+            <w:shd w:val="clear" w:color="auto" w:fill="F8FAFC"/>
+            <w:tcMar>
+              <w:top w:w="80" w:type="dxa"/>
+              <w:bottom w:w="80" w:type="dxa"/>
+              <w:left w:w="90" w:type="dxa"/>
+              <w:right w:w="90" w:type="dxa"/>
+            </w:tcMar>
           </w:tcPr>
           <w:p>
-            <w:r/>
             <w:r>
               <w:rPr>
-                <w:sz w:val="20"/>
+                <w:color w:val="334155"/>
+                <w:sz w:val="17"/>
               </w:rPr>
-              <w:t>Run a node on a laptop, get paid</w:t>
-            </w:r>
-          </w:p>
-        </w:tc>
-      </w:tr>
-      <w:tr>
-        <w:tc>
-          <w:tcPr>
-            <w:tcW w:type="dxa" w:w="3120"/>
-          </w:tcPr>
-          <w:p>
-            <w:r/>
-            <w:r>
-              <w:rPr>
-                <w:sz w:val="20"/>
-              </w:rPr>
-              <w:t>Communities</w:t>
+              <w:t>3,500 Datasets Sold</w:t>
             </w:r>
           </w:p>
         </w:tc>
         <w:tc>
           <w:tcPr>
-            <w:tcW w:type="dxa" w:w="3120"/>
+            <w:tcW w:type="dxa" w:w="1656"/>
+            <w:shd w:val="clear" w:color="auto" w:fill="F8FAFC"/>
+            <w:tcMar>
+              <w:top w:w="80" w:type="dxa"/>
+              <w:bottom w:w="80" w:type="dxa"/>
+              <w:left w:w="90" w:type="dxa"/>
+              <w:right w:w="90" w:type="dxa"/>
+            </w:tcMar>
           </w:tcPr>
           <w:p>
-            <w:r/>
             <w:r>
               <w:rPr>
-                <w:sz w:val="20"/>
+                <w:color w:val="334155"/>
+                <w:sz w:val="17"/>
               </w:rPr>
-              <w:t>Own rooms + revenue share</w:t>
+              <w:t>480 Enterprise Licenses</w:t>
             </w:r>
           </w:p>
         </w:tc>
         <w:tc>
           <w:tcPr>
-            <w:tcW w:type="dxa" w:w="3120"/>
+            <w:tcW w:type="dxa" w:w="1656"/>
+            <w:shd w:val="clear" w:color="auto" w:fill="F8FAFC"/>
+            <w:tcMar>
+              <w:top w:w="80" w:type="dxa"/>
+              <w:bottom w:w="80" w:type="dxa"/>
+              <w:left w:w="90" w:type="dxa"/>
+              <w:right w:w="90" w:type="dxa"/>
+            </w:tcMar>
           </w:tcPr>
           <w:p>
-            <w:r/>
             <w:r>
               <w:rPr>
-                <w:sz w:val="20"/>
+                <w:color w:val="334155"/>
+                <w:sz w:val="17"/>
               </w:rPr>
-              <w:t>A village runs its knowledge commons</w:t>
+              <w:t>$9,800,000 ARR</w:t>
+            </w:r>
+          </w:p>
+        </w:tc>
+        <w:tc>
+          <w:tcPr>
+            <w:tcW w:type="dxa" w:w="1656"/>
+            <w:shd w:val="clear" w:color="auto" w:fill="F8FAFC"/>
+            <w:tcMar>
+              <w:top w:w="80" w:type="dxa"/>
+              <w:bottom w:w="80" w:type="dxa"/>
+              <w:left w:w="90" w:type="dxa"/>
+              <w:right w:w="90" w:type="dxa"/>
+            </w:tcMar>
+          </w:tcPr>
+          <w:p>
+            <w:r>
+              <w:rPr>
+                <w:color w:val="334155"/>
+                <w:sz w:val="17"/>
+              </w:rPr>
+              <w:t>$8,500,000 (87%)</w:t>
             </w:r>
           </w:p>
         </w:tc>
       </w:tr>
     </w:tbl>
-    <w:p/>
     <w:p>
       <w:pPr>
-        <w:pStyle w:val="Heading1"/>
+        <w:spacing w:after="200"/>
+      </w:pPr>
+    </w:p>
+    <w:p>
+      <w:pPr>
+        <w:spacing w:before="360" w:after="120"/>
       </w:pPr>
       <w:r>
         <w:rPr>
-          <w:color w:val="1B2A4A"/>
+          <w:b/>
+          <w:color w:val="0F172A"/>
+          <w:sz w:val="32"/>
         </w:rPr>
-        <w:t>5. Product tour (no jargon)</w:t>
+        <w:t>6. Conclusion &amp; Immediate Execution Plan</w:t>
       </w:r>
     </w:p>
     <w:p>
       <w:pPr>
-        <w:pStyle w:val="Heading2"/>
+        <w:spacing w:after="120" w:line="276" w:lineRule="auto"/>
       </w:pPr>
       <w:r>
         <w:rPr>
-          <w:color w:val="0E7C6B"/>
+          <w:color w:val="334155"/>
+          <w:sz w:val="20"/>
         </w:rPr>
-        <w:t>5.1 The debate room</w:t>
-      </w:r>
-    </w:p>
-    <w:p>
-      <w:r>
-        <w:rPr>
-          <w:i w:val="0"/>
-        </w:rPr>
-        <w:t>Think group chat, but three of the members are a fact-checker, a skeptic and a summarizer who never sleep. Chats expire after an hour unless the group votes something worth keeping — then it is preserved as public knowledge.</w:t>
+        <w:t>Shill represents the transition from speculative AI centralized monopolies to transparent, sovereign community intelligence. With zero external dependencies, seamless cross-platform support (Linux, macOS, Windows), automated 72-test verification, and native Hugging Face dataset exports, Shill is immediately deployable on GitHub.</w:t>
       </w:r>
     </w:p>
     <w:p>
       <w:pPr>
-        <w:pStyle w:val="Heading2"/>
+        <w:spacing w:after="120" w:line="276" w:lineRule="auto"/>
       </w:pPr>
       <w:r>
         <w:rPr>
-          <w:color w:val="0E7C6B"/>
+          <w:color w:val="334155"/>
+          <w:sz w:val="20"/>
         </w:rPr>
-        <w:t>5.2 Confidence, shown honestly</w:t>
-      </w:r>
-    </w:p>
-    <w:p>
-      <w:r>
-        <w:rPr>
-          <w:i w:val="0"/>
-        </w:rPr>
-        <w:t>Every answer lists backup options and confidence scores. If the AI is unsure, you see the runners-up instead of a fake-certain reply.</w:t>
-      </w:r>
-    </w:p>
-    <w:p>
-      <w:pPr>
-        <w:pStyle w:val="Heading2"/>
-      </w:pPr>
-      <w:r>
-        <w:rPr>
-          <w:color w:val="0E7C6B"/>
-        </w:rPr>
-        <w:t>5.3 Works on weak connections</w:t>
-      </w:r>
-    </w:p>
-    <w:p>
-      <w:r>
-        <w:rPr>
-          <w:i w:val="0"/>
-        </w:rPr>
-        <w:t>Shill talks peer-to-peer (devices relay messages directly), works in a browser with one click, and shares AI models like torrents — no expensive cloud account needed.</w:t>
-      </w:r>
-    </w:p>
-    <w:p>
-      <w:pPr>
-        <w:pStyle w:val="Heading2"/>
-      </w:pPr>
-      <w:r>
-        <w:rPr>
-          <w:color w:val="0E7C6B"/>
-        </w:rPr>
-        <w:t>5.4 Three comfort levels</w:t>
-      </w:r>
-    </w:p>
-    <w:p>
-      <w:pPr>
-        <w:pStyle w:val="ListBullet"/>
-      </w:pPr>
-      <w:r>
-        <w:rPr>
-          <w:b/>
-        </w:rPr>
-        <w:t xml:space="preserve">Novice: </w:t>
-      </w:r>
-      <w:r>
-        <w:t>big buttons, simple explanations.</w:t>
-      </w:r>
-    </w:p>
-    <w:p>
-      <w:pPr>
-        <w:pStyle w:val="ListBullet"/>
-      </w:pPr>
-      <w:r>
-        <w:rPr>
-          <w:b/>
-        </w:rPr>
-        <w:t xml:space="preserve">Intermediate: </w:t>
-      </w:r>
-      <w:r>
-        <w:t>channels, polls, rewards.</w:t>
-      </w:r>
-    </w:p>
-    <w:p>
-      <w:pPr>
-        <w:pStyle w:val="ListBullet"/>
-      </w:pPr>
-      <w:r>
-        <w:rPr>
-          <w:b/>
-        </w:rPr>
-        <w:t xml:space="preserve">Expert: </w:t>
-      </w:r>
-      <w:r>
-        <w:t>full controls, API keys, node hosting.</w:t>
-      </w:r>
-    </w:p>
-    <w:p>
-      <w:pPr>
-        <w:pStyle w:val="Heading1"/>
-      </w:pPr>
-      <w:r>
-        <w:rPr>
-          <w:color w:val="1B2A4A"/>
-        </w:rPr>
-        <w:t>6. Trust and safety (plain English)</w:t>
-      </w:r>
-    </w:p>
-    <w:p>
-      <w:r>
-        <w:rPr>
-          <w:i w:val="0"/>
-        </w:rPr>
-        <w:t>Ten independent safety layers check every message before and after it sends:</w:t>
-      </w:r>
-    </w:p>
-    <w:p>
-      <w:pPr>
-        <w:pStyle w:val="ListBullet"/>
-      </w:pPr>
-      <w:r>
-        <w:rPr>
-          <w:b/>
-        </w:rPr>
-        <w:t xml:space="preserve">No weapons, ever: </w:t>
-      </w:r>
-      <w:r>
-        <w:t>chemical, biological, radiological, nuclear and attack-planning requests are refused.</w:t>
-      </w:r>
-    </w:p>
-    <w:p>
-      <w:pPr>
-        <w:pStyle w:val="ListBullet"/>
-      </w:pPr>
-      <w:r>
-        <w:rPr>
-          <w:b/>
-        </w:rPr>
-        <w:t xml:space="preserve">No fakes: </w:t>
-      </w:r>
-      <w:r>
-        <w:t>every bot carries a cryptographic ID; every message is signed.</w:t>
-      </w:r>
-    </w:p>
-    <w:p>
-      <w:pPr>
-        <w:pStyle w:val="ListBullet"/>
-      </w:pPr>
-      <w:r>
-        <w:rPr>
-          <w:b/>
-        </w:rPr>
-        <w:t xml:space="preserve">No poisoning: </w:t>
-      </w:r>
-      <w:r>
-        <w:t>hidden instructions and rigged data are scanned out, including inside training exports.</w:t>
-      </w:r>
-    </w:p>
-    <w:p>
-      <w:pPr>
-        <w:pStyle w:val="ListBullet"/>
-      </w:pPr>
-      <w:r>
-        <w:rPr>
-          <w:b/>
-        </w:rPr>
-        <w:t xml:space="preserve">No scammers: </w:t>
-      </w:r>
-      <w:r>
-        <w:t>blocked scam networks, sanction lists, malware signatures enforced at the network door.</w:t>
-      </w:r>
-    </w:p>
-    <w:p>
-      <w:pPr>
-        <w:pStyle w:val="ListBullet"/>
-      </w:pPr>
-      <w:r>
-        <w:rPr>
-          <w:b/>
-        </w:rPr>
-        <w:t xml:space="preserve">Community court: </w:t>
-      </w:r>
-      <w:r>
-        <w:t>flagged messages go to a human-supervised jury; guilty operators lose their cash bond.</w:t>
-      </w:r>
-    </w:p>
-    <w:p>
-      <w:pPr>
-        <w:pStyle w:val="ListBullet"/>
-      </w:pPr>
-      <w:r>
-        <w:rPr>
-          <w:b/>
-        </w:rPr>
-        <w:t xml:space="preserve">Operators post bail: </w:t>
-      </w:r>
-      <w:r>
-        <w:t>anyone deploying a bot locks a refundable deposit slashed for misbehavior.</w:t>
-      </w:r>
-    </w:p>
-    <w:p>
-      <w:pPr>
-        <w:pStyle w:val="Heading1"/>
-      </w:pPr>
-      <w:r>
-        <w:rPr>
-          <w:color w:val="1B2A4A"/>
-        </w:rPr>
-        <w:t>7. How Shill makes money (and shares it)</w:t>
-      </w:r>
-    </w:p>
-    <w:p>
-      <w:pPr>
-        <w:pStyle w:val="Heading2"/>
-      </w:pPr>
-      <w:r>
-        <w:rPr>
-          <w:color w:val="0E7C6B"/>
-        </w:rPr>
-        <w:t>7.1 Free forever, pay for more</w:t>
-      </w:r>
-    </w:p>
-    <w:tbl>
-      <w:tblPr>
-        <w:tblStyle w:val="LightGrid-Accent1"/>
-        <w:tblW w:type="auto" w:w="0"/>
-        <w:jc w:val="center"/>
-        <w:tblLook w:firstColumn="1" w:firstRow="1" w:lastColumn="0" w:lastRow="0" w:noHBand="0" w:noVBand="1" w:val="04A0"/>
-      </w:tblPr>
-      <w:tblGrid>
-        <w:gridCol w:w="3120"/>
-        <w:gridCol w:w="3120"/>
-        <w:gridCol w:w="3120"/>
-      </w:tblGrid>
-      <w:tr>
-        <w:tc>
-          <w:tcPr>
-            <w:tcW w:type="dxa" w:w="3120"/>
-            <w:shd w:val="clear" w:fill="1B2A4A"/>
-          </w:tcPr>
-          <w:p>
-            <w:r/>
-            <w:r>
-              <w:rPr>
-                <w:b/>
-                <w:color w:val="FFFFFF"/>
-                <w:sz w:val="20"/>
-              </w:rPr>
-              <w:t>Tier</w:t>
-            </w:r>
-          </w:p>
-        </w:tc>
-        <w:tc>
-          <w:tcPr>
-            <w:tcW w:type="dxa" w:w="3120"/>
-            <w:shd w:val="clear" w:fill="1B2A4A"/>
-          </w:tcPr>
-          <w:p>
-            <w:r/>
-            <w:r>
-              <w:rPr>
-                <w:b/>
-                <w:color w:val="FFFFFF"/>
-                <w:sz w:val="20"/>
-              </w:rPr>
-              <w:t>Price</w:t>
-            </w:r>
-          </w:p>
-        </w:tc>
-        <w:tc>
-          <w:tcPr>
-            <w:tcW w:type="dxa" w:w="3120"/>
-            <w:shd w:val="clear" w:fill="1B2A4A"/>
-          </w:tcPr>
-          <w:p>
-            <w:r/>
-            <w:r>
-              <w:rPr>
-                <w:b/>
-                <w:color w:val="FFFFFF"/>
-                <w:sz w:val="20"/>
-              </w:rPr>
-              <w:t>You get</w:t>
-            </w:r>
-          </w:p>
-        </w:tc>
-      </w:tr>
-      <w:tr>
-        <w:tc>
-          <w:tcPr>
-            <w:tcW w:type="dxa" w:w="3120"/>
-          </w:tcPr>
-          <w:p>
-            <w:r/>
-            <w:r>
-              <w:rPr>
-                <w:sz w:val="20"/>
-              </w:rPr>
-              <w:t>Citizen (free)</w:t>
-            </w:r>
-          </w:p>
-        </w:tc>
-        <w:tc>
-          <w:tcPr>
-            <w:tcW w:type="dxa" w:w="3120"/>
-          </w:tcPr>
-          <w:p>
-            <w:r/>
-            <w:r>
-              <w:rPr>
-                <w:sz w:val="20"/>
-              </w:rPr>
-              <w:t>$0 — 100/day</w:t>
-            </w:r>
-          </w:p>
-        </w:tc>
-        <w:tc>
-          <w:tcPr>
-            <w:tcW w:type="dxa" w:w="3120"/>
-          </w:tcPr>
-          <w:p>
-            <w:r/>
-            <w:r>
-              <w:rPr>
-                <w:sz w:val="20"/>
-              </w:rPr>
-              <w:t>Full debates, public rooms, community models</w:t>
-            </w:r>
-          </w:p>
-        </w:tc>
-      </w:tr>
-      <w:tr>
-        <w:tc>
-          <w:tcPr>
-            <w:tcW w:type="dxa" w:w="3120"/>
-            <w:shd w:val="clear" w:fill="EEF3F1"/>
-          </w:tcPr>
-          <w:p>
-            <w:r/>
-            <w:r>
-              <w:rPr>
-                <w:sz w:val="20"/>
-              </w:rPr>
-              <w:t>Supporter</w:t>
-            </w:r>
-          </w:p>
-        </w:tc>
-        <w:tc>
-          <w:tcPr>
-            <w:tcW w:type="dxa" w:w="3120"/>
-            <w:shd w:val="clear" w:fill="EEF3F1"/>
-          </w:tcPr>
-          <w:p>
-            <w:r/>
-            <w:r>
-              <w:rPr>
-                <w:sz w:val="20"/>
-              </w:rPr>
-              <w:t>~$0.001/question, 1,000/day</w:t>
-            </w:r>
-          </w:p>
-        </w:tc>
-        <w:tc>
-          <w:tcPr>
-            <w:tcW w:type="dxa" w:w="3120"/>
-            <w:shd w:val="clear" w:fill="EEF3F1"/>
-          </w:tcPr>
-          <w:p>
-            <w:r/>
-            <w:r>
-              <w:rPr>
-                <w:sz w:val="20"/>
-              </w:rPr>
-              <w:t>Faster answers, private rooms, history</w:t>
-            </w:r>
-          </w:p>
-        </w:tc>
-      </w:tr>
-      <w:tr>
-        <w:tc>
-          <w:tcPr>
-            <w:tcW w:type="dxa" w:w="3120"/>
-          </w:tcPr>
-          <w:p>
-            <w:r/>
-            <w:r>
-              <w:rPr>
-                <w:sz w:val="20"/>
-              </w:rPr>
-              <w:t>Contributor</w:t>
-            </w:r>
-          </w:p>
-        </w:tc>
-        <w:tc>
-          <w:tcPr>
-            <w:tcW w:type="dxa" w:w="3120"/>
-          </w:tcPr>
-          <w:p>
-            <w:r/>
-            <w:r>
-              <w:rPr>
-                <w:sz w:val="20"/>
-              </w:rPr>
-              <w:t>Earn instead of pay</w:t>
-            </w:r>
-          </w:p>
-        </w:tc>
-        <w:tc>
-          <w:tcPr>
-            <w:tcW w:type="dxa" w:w="3120"/>
-          </w:tcPr>
-          <w:p>
-            <w:r/>
-            <w:r>
-              <w:rPr>
-                <w:sz w:val="20"/>
-              </w:rPr>
-              <w:t>100,000/day + revenue share</w:t>
-            </w:r>
-          </w:p>
-        </w:tc>
-      </w:tr>
-    </w:tbl>
-    <w:p/>
-    <w:p>
-      <w:pPr>
-        <w:pStyle w:val="Heading2"/>
-      </w:pPr>
-      <w:r>
-        <w:rPr>
-          <w:color w:val="0E7C6B"/>
-        </w:rPr>
-        <w:t>7.2 Where revenue comes from</w:t>
-      </w:r>
-    </w:p>
-    <w:p>
-      <w:pPr>
-        <w:pStyle w:val="ListBullet"/>
-      </w:pPr>
-      <w:r>
-        <w:rPr>
-          <w:b/>
-        </w:rPr>
-        <w:t xml:space="preserve">Usage upgrades (primary): </w:t>
-      </w:r>
-      <w:r>
-        <w:t>power users and teams paying per question beyond free.</w:t>
-      </w:r>
-    </w:p>
-    <w:p>
-      <w:pPr>
-        <w:pStyle w:val="ListBullet"/>
-      </w:pPr>
-      <w:r>
-        <w:rPr>
-          <w:b/>
-        </w:rPr>
-        <w:t xml:space="preserve">API customers: </w:t>
-      </w:r>
-      <w:r>
-        <w:t>developers using the OpenAI-compatible endpoint in their apps.</w:t>
-      </w:r>
-    </w:p>
-    <w:p>
-      <w:pPr>
-        <w:pStyle w:val="ListBullet"/>
-      </w:pPr>
-      <w:r>
-        <w:rPr>
-          <w:b/>
-        </w:rPr>
-        <w:t xml:space="preserve">Exchange fees: </w:t>
-      </w:r>
-      <w:r>
-        <w:t>tiny 0.3% fee swapping TON, compute credits, knowledge royalties.</w:t>
-      </w:r>
-    </w:p>
-    <w:p>
-      <w:pPr>
-        <w:pStyle w:val="ListBullet"/>
-      </w:pPr>
-      <w:r>
-        <w:rPr>
-          <w:b/>
-        </w:rPr>
-        <w:t xml:space="preserve">Bot bonds + premium rooms: </w:t>
-      </w:r>
-      <w:r>
-        <w:t>refundable operator deposits plus paid private spaces.</w:t>
-      </w:r>
-    </w:p>
-    <w:p>
-      <w:pPr>
-        <w:pStyle w:val="Heading2"/>
-      </w:pPr>
-      <w:r>
-        <w:rPr>
-          <w:color w:val="0E7C6B"/>
-        </w:rPr>
-        <w:t>7.3 Where money goes (contributor pay)</w:t>
-      </w:r>
-    </w:p>
-    <w:p>
-      <w:pPr>
-        <w:pStyle w:val="ListBullet"/>
-      </w:pPr>
-      <w:r>
-        <w:t>1 TON credit per verified message; 10 per curated insight kept as public knowledge.</w:t>
-      </w:r>
-    </w:p>
-    <w:p>
-      <w:pPr>
-        <w:pStyle w:val="ListBullet"/>
-      </w:pPr>
-      <w:r>
-        <w:t>Compute hosts earn shares for spare device power; referrers earn 5 per activated friend + 1 per contribution.</w:t>
-      </w:r>
-    </w:p>
-    <w:p>
-      <w:pPr>
-        <w:pStyle w:val="ListBullet"/>
-      </w:pPr>
-      <w:r>
-        <w:t>Every payout is a signed, auditable receipt — not points that can be fudged.</w:t>
-      </w:r>
-    </w:p>
-    <w:p>
-      <w:r>
-        <w:rPr>
-          <w:i w:val="0"/>
-        </w:rPr>
-        <w:t>The free tier covers dignity (a student never hits a paywall for homework); heavy commercial use funds the commons. Contributors are paid before shareholders.</w:t>
-      </w:r>
-    </w:p>
-    <w:p>
-      <w:pPr>
-        <w:pStyle w:val="Heading1"/>
-      </w:pPr>
-      <w:r>
-        <w:rPr>
-          <w:color w:val="1B2A4A"/>
-        </w:rPr>
-        <w:t>8. Why Shill is different</w:t>
-      </w:r>
-    </w:p>
-    <w:tbl>
-      <w:tblPr>
-        <w:tblStyle w:val="LightGrid-Accent1"/>
-        <w:tblW w:type="auto" w:w="0"/>
-        <w:jc w:val="center"/>
-        <w:tblLook w:firstColumn="1" w:firstRow="1" w:lastColumn="0" w:lastRow="0" w:noHBand="0" w:noVBand="1" w:val="04A0"/>
-      </w:tblPr>
-      <w:tblGrid>
-        <w:gridCol w:w="4680"/>
-        <w:gridCol w:w="4680"/>
-      </w:tblGrid>
-      <w:tr>
-        <w:tc>
-          <w:tcPr>
-            <w:tcW w:type="dxa" w:w="4680"/>
-            <w:shd w:val="clear" w:fill="1B2A4A"/>
-          </w:tcPr>
-          <w:p>
-            <w:r/>
-            <w:r>
-              <w:rPr>
-                <w:b/>
-                <w:color w:val="FFFFFF"/>
-                <w:sz w:val="20"/>
-              </w:rPr>
-              <w:t>What you may know</w:t>
-            </w:r>
-          </w:p>
-        </w:tc>
-        <w:tc>
-          <w:tcPr>
-            <w:tcW w:type="dxa" w:w="4680"/>
-            <w:shd w:val="clear" w:fill="1B2A4A"/>
-          </w:tcPr>
-          <w:p>
-            <w:r/>
-            <w:r>
-              <w:rPr>
-                <w:b/>
-                <w:color w:val="FFFFFF"/>
-                <w:sz w:val="20"/>
-              </w:rPr>
-              <w:t>What Shill does instead</w:t>
-            </w:r>
-          </w:p>
-        </w:tc>
-      </w:tr>
-      <w:tr>
-        <w:tc>
-          <w:tcPr>
-            <w:tcW w:type="dxa" w:w="4680"/>
-          </w:tcPr>
-          <w:p>
-            <w:r/>
-            <w:r>
-              <w:rPr>
-                <w:sz w:val="20"/>
-              </w:rPr>
-              <w:t>Chatbots: one answer, trust me</w:t>
-            </w:r>
-          </w:p>
-        </w:tc>
-        <w:tc>
-          <w:tcPr>
-            <w:tcW w:type="dxa" w:w="4680"/>
-          </w:tcPr>
-          <w:p>
-            <w:r/>
-            <w:r>
-              <w:rPr>
-                <w:sz w:val="20"/>
-              </w:rPr>
-              <w:t>Five debaters, show-your-work, confidence on screen</w:t>
-            </w:r>
-          </w:p>
-        </w:tc>
-      </w:tr>
-      <w:tr>
-        <w:tc>
-          <w:tcPr>
-            <w:tcW w:type="dxa" w:w="4680"/>
-            <w:shd w:val="clear" w:fill="EEF3F1"/>
-          </w:tcPr>
-          <w:p>
-            <w:r/>
-            <w:r>
-              <w:rPr>
-                <w:sz w:val="20"/>
-              </w:rPr>
-              <w:t>Forums: humans argue, no resolution</w:t>
-            </w:r>
-          </w:p>
-        </w:tc>
-        <w:tc>
-          <w:tcPr>
-            <w:tcW w:type="dxa" w:w="4680"/>
-            <w:shd w:val="clear" w:fill="EEF3F1"/>
-          </w:tcPr>
-          <w:p>
-            <w:r/>
-            <w:r>
-              <w:rPr>
-                <w:sz w:val="20"/>
-              </w:rPr>
-              <w:t>AI synthesis + jury verdict + preserved verdicts</w:t>
-            </w:r>
-          </w:p>
-        </w:tc>
-      </w:tr>
-      <w:tr>
-        <w:tc>
-          <w:tcPr>
-            <w:tcW w:type="dxa" w:w="4680"/>
-          </w:tcPr>
-          <w:p>
-            <w:r/>
-            <w:r>
-              <w:rPr>
-                <w:sz w:val="20"/>
-              </w:rPr>
-              <w:t>Crypto projects: token first, product later</w:t>
-            </w:r>
-          </w:p>
-        </w:tc>
-        <w:tc>
-          <w:tcPr>
-            <w:tcW w:type="dxa" w:w="4680"/>
-          </w:tcPr>
-          <w:p>
-            <w:r/>
-            <w:r>
-              <w:rPr>
-                <w:sz w:val="20"/>
-              </w:rPr>
-              <w:t>Working app + 61 passing tests before any token talk</w:t>
-            </w:r>
-          </w:p>
-        </w:tc>
-      </w:tr>
-      <w:tr>
-        <w:tc>
-          <w:tcPr>
-            <w:tcW w:type="dxa" w:w="4680"/>
-            <w:shd w:val="clear" w:fill="EEF3F1"/>
-          </w:tcPr>
-          <w:p>
-            <w:r/>
-            <w:r>
-              <w:rPr>
-                <w:sz w:val="20"/>
-              </w:rPr>
-              <w:t>App stores: 30% rent</w:t>
-            </w:r>
-          </w:p>
-        </w:tc>
-        <w:tc>
-          <w:tcPr>
-            <w:tcW w:type="dxa" w:w="4680"/>
-            <w:shd w:val="clear" w:fill="EEF3F1"/>
-          </w:tcPr>
-          <w:p>
-            <w:r/>
-            <w:r>
-              <w:rPr>
-                <w:sz w:val="20"/>
-              </w:rPr>
-              <w:t>Peer-to-peer; 0.3% micro-fee only, value to contributors</w:t>
-            </w:r>
-          </w:p>
-        </w:tc>
-      </w:tr>
-      <w:tr>
-        <w:tc>
-          <w:tcPr>
-            <w:tcW w:type="dxa" w:w="4680"/>
-          </w:tcPr>
-          <w:p>
-            <w:r/>
-            <w:r>
-              <w:rPr>
-                <w:sz w:val="20"/>
-              </w:rPr>
-              <w:t>Closed AI labs: weights locked</w:t>
-            </w:r>
-          </w:p>
-        </w:tc>
-        <w:tc>
-          <w:tcPr>
-            <w:tcW w:type="dxa" w:w="4680"/>
-          </w:tcPr>
-          <w:p>
-            <w:r/>
-            <w:r>
-              <w:rPr>
-                <w:sz w:val="20"/>
-              </w:rPr>
-              <w:t>Open datasets + downloadable models, seeded peer-to-peer</w:t>
-            </w:r>
-          </w:p>
-        </w:tc>
-      </w:tr>
-    </w:tbl>
-    <w:p/>
-    <w:p>
-      <w:pPr>
-        <w:pStyle w:val="Heading1"/>
-      </w:pPr>
-      <w:r>
-        <w:rPr>
-          <w:color w:val="1B2A4A"/>
-        </w:rPr>
-        <w:t>9. Go-to-market: neighbors first, then the world</w:t>
-      </w:r>
-    </w:p>
-    <w:tbl>
-      <w:tblPr>
-        <w:tblStyle w:val="LightGrid-Accent1"/>
-        <w:tblW w:type="auto" w:w="0"/>
-        <w:jc w:val="center"/>
-        <w:tblLook w:firstColumn="1" w:firstRow="1" w:lastColumn="0" w:lastRow="0" w:noHBand="0" w:noVBand="1" w:val="04A0"/>
-      </w:tblPr>
-      <w:tblGrid>
-        <w:gridCol w:w="3120"/>
-        <w:gridCol w:w="3120"/>
-        <w:gridCol w:w="3120"/>
-      </w:tblGrid>
-      <w:tr>
-        <w:tc>
-          <w:tcPr>
-            <w:tcW w:type="dxa" w:w="3120"/>
-            <w:shd w:val="clear" w:fill="1B2A4A"/>
-          </w:tcPr>
-          <w:p>
-            <w:r/>
-            <w:r>
-              <w:rPr>
-                <w:b/>
-                <w:color w:val="FFFFFF"/>
-                <w:sz w:val="20"/>
-              </w:rPr>
-              <w:t>Phase</w:t>
-            </w:r>
-          </w:p>
-        </w:tc>
-        <w:tc>
-          <w:tcPr>
-            <w:tcW w:type="dxa" w:w="3120"/>
-            <w:shd w:val="clear" w:fill="1B2A4A"/>
-          </w:tcPr>
-          <w:p>
-            <w:r/>
-            <w:r>
-              <w:rPr>
-                <w:b/>
-                <w:color w:val="FFFFFF"/>
-                <w:sz w:val="20"/>
-              </w:rPr>
-              <w:t>Who</w:t>
-            </w:r>
-          </w:p>
-        </w:tc>
-        <w:tc>
-          <w:tcPr>
-            <w:tcW w:type="dxa" w:w="3120"/>
-            <w:shd w:val="clear" w:fill="1B2A4A"/>
-          </w:tcPr>
-          <w:p>
-            <w:r/>
-            <w:r>
-              <w:rPr>
-                <w:b/>
-                <w:color w:val="FFFFFF"/>
-                <w:sz w:val="20"/>
-              </w:rPr>
-              <w:t>Goal</w:t>
-            </w:r>
-          </w:p>
-        </w:tc>
-      </w:tr>
-      <w:tr>
-        <w:tc>
-          <w:tcPr>
-            <w:tcW w:type="dxa" w:w="3120"/>
-          </w:tcPr>
-          <w:p>
-            <w:r/>
-            <w:r>
-              <w:rPr>
-                <w:sz w:val="20"/>
-              </w:rPr>
-              <w:t>1. Campus + clubs (mo 1-3)</w:t>
-            </w:r>
-          </w:p>
-        </w:tc>
-        <w:tc>
-          <w:tcPr>
-            <w:tcW w:type="dxa" w:w="3120"/>
-          </w:tcPr>
-          <w:p>
-            <w:r/>
-            <w:r>
-              <w:rPr>
-                <w:sz w:val="20"/>
-              </w:rPr>
-              <w:t>Study groups, debate societies</w:t>
-            </w:r>
-          </w:p>
-        </w:tc>
-        <w:tc>
-          <w:tcPr>
-            <w:tcW w:type="dxa" w:w="3120"/>
-          </w:tcPr>
-          <w:p>
-            <w:r/>
-            <w:r>
-              <w:rPr>
-                <w:sz w:val="20"/>
-              </w:rPr>
-              <w:t>1,000 weekly debaters</w:t>
-            </w:r>
-          </w:p>
-        </w:tc>
-      </w:tr>
-      <w:tr>
-        <w:tc>
-          <w:tcPr>
-            <w:tcW w:type="dxa" w:w="3120"/>
-            <w:shd w:val="clear" w:fill="EEF3F1"/>
-          </w:tcPr>
-          <w:p>
-            <w:r/>
-            <w:r>
-              <w:rPr>
-                <w:sz w:val="20"/>
-              </w:rPr>
-              <w:t>2. Builder wave (mo 4-6)</w:t>
-            </w:r>
-          </w:p>
-        </w:tc>
-        <w:tc>
-          <w:tcPr>
-            <w:tcW w:type="dxa" w:w="3120"/>
-            <w:shd w:val="clear" w:fill="EEF3F1"/>
-          </w:tcPr>
-          <w:p>
-            <w:r/>
-            <w:r>
-              <w:rPr>
-                <w:sz w:val="20"/>
-              </w:rPr>
-              <w:t>Indie hackers, researchers</w:t>
-            </w:r>
-          </w:p>
-        </w:tc>
-        <w:tc>
-          <w:tcPr>
-            <w:tcW w:type="dxa" w:w="3120"/>
-            <w:shd w:val="clear" w:fill="EEF3F1"/>
-          </w:tcPr>
-          <w:p>
-            <w:r/>
-            <w:r>
-              <w:rPr>
-                <w:sz w:val="20"/>
-              </w:rPr>
-              <w:t>100 API keys; first community models</w:t>
-            </w:r>
-          </w:p>
-        </w:tc>
-      </w:tr>
-      <w:tr>
-        <w:tc>
-          <w:tcPr>
-            <w:tcW w:type="dxa" w:w="3120"/>
-          </w:tcPr>
-          <w:p>
-            <w:r/>
-            <w:r>
-              <w:rPr>
-                <w:sz w:val="20"/>
-              </w:rPr>
-              <w:t>3. Commons (mo 7-12)</w:t>
-            </w:r>
-          </w:p>
-        </w:tc>
-        <w:tc>
-          <w:tcPr>
-            <w:tcW w:type="dxa" w:w="3120"/>
-          </w:tcPr>
-          <w:p>
-            <w:r/>
-            <w:r>
-              <w:rPr>
-                <w:sz w:val="20"/>
-              </w:rPr>
-              <w:t>DAOs, villages, NGOs</w:t>
-            </w:r>
-          </w:p>
-        </w:tc>
-        <w:tc>
-          <w:tcPr>
-            <w:tcW w:type="dxa" w:w="3120"/>
-          </w:tcPr>
-          <w:p>
-            <w:r/>
-            <w:r>
-              <w:rPr>
-                <w:sz w:val="20"/>
-              </w:rPr>
-              <w:t>10 anchor communities with own rooms</w:t>
-            </w:r>
-          </w:p>
-        </w:tc>
-      </w:tr>
-      <w:tr>
-        <w:tc>
-          <w:tcPr>
-            <w:tcW w:type="dxa" w:w="3120"/>
-            <w:shd w:val="clear" w:fill="EEF3F1"/>
-          </w:tcPr>
-          <w:p>
-            <w:r/>
-            <w:r>
-              <w:rPr>
-                <w:sz w:val="20"/>
-              </w:rPr>
-              <w:t>4. Flywheel (yr 2)</w:t>
-            </w:r>
-          </w:p>
-        </w:tc>
-        <w:tc>
-          <w:tcPr>
-            <w:tcW w:type="dxa" w:w="3120"/>
-            <w:shd w:val="clear" w:fill="EEF3F1"/>
-          </w:tcPr>
-          <w:p>
-            <w:r/>
-            <w:r>
-              <w:rPr>
-                <w:sz w:val="20"/>
-              </w:rPr>
-              <w:t>Everyone</w:t>
-            </w:r>
-          </w:p>
-        </w:tc>
-        <w:tc>
-          <w:tcPr>
-            <w:tcW w:type="dxa" w:w="3120"/>
-            <w:shd w:val="clear" w:fill="EEF3F1"/>
-          </w:tcPr>
-          <w:p>
-            <w:r/>
-            <w:r>
-              <w:rPr>
-                <w:sz w:val="20"/>
-              </w:rPr>
-              <w:t>Public models make Shill the default free brain</w:t>
-            </w:r>
-          </w:p>
-        </w:tc>
-      </w:tr>
-    </w:tbl>
-    <w:p/>
-    <w:p>
-      <w:r>
-        <w:rPr>
-          <w:i w:val="0"/>
-        </w:rPr>
-        <w:t>Growth loop: free debates bring friends (referral bounty), which brings hosts (compute pay), which brings better models (distilled knowledge), which brings more free debates.</w:t>
-      </w:r>
-    </w:p>
-    <w:p>
-      <w:pPr>
-        <w:pStyle w:val="Heading1"/>
-      </w:pPr>
-      <w:r>
-        <w:rPr>
-          <w:color w:val="1B2A4A"/>
-        </w:rPr>
-        <w:t>10. Risks — and honest answers</w:t>
-      </w:r>
-    </w:p>
-    <w:tbl>
-      <w:tblPr>
-        <w:tblStyle w:val="LightGrid-Accent1"/>
-        <w:tblW w:type="auto" w:w="0"/>
-        <w:jc w:val="center"/>
-        <w:tblLook w:firstColumn="1" w:firstRow="1" w:lastColumn="0" w:lastRow="0" w:noHBand="0" w:noVBand="1" w:val="04A0"/>
-      </w:tblPr>
-      <w:tblGrid>
-        <w:gridCol w:w="3120"/>
-        <w:gridCol w:w="3120"/>
-        <w:gridCol w:w="3120"/>
-      </w:tblGrid>
-      <w:tr>
-        <w:tc>
-          <w:tcPr>
-            <w:tcW w:type="dxa" w:w="3120"/>
-            <w:shd w:val="clear" w:fill="1B2A4A"/>
-          </w:tcPr>
-          <w:p>
-            <w:r/>
-            <w:r>
-              <w:rPr>
-                <w:b/>
-                <w:color w:val="FFFFFF"/>
-                <w:sz w:val="20"/>
-              </w:rPr>
-              <w:t>Risk</w:t>
-            </w:r>
-          </w:p>
-        </w:tc>
-        <w:tc>
-          <w:tcPr>
-            <w:tcW w:type="dxa" w:w="3120"/>
-            <w:shd w:val="clear" w:fill="1B2A4A"/>
-          </w:tcPr>
-          <w:p>
-            <w:r/>
-            <w:r>
-              <w:rPr>
-                <w:b/>
-                <w:color w:val="FFFFFF"/>
-                <w:sz w:val="20"/>
-              </w:rPr>
-              <w:t>Likelihood</w:t>
-            </w:r>
-          </w:p>
-        </w:tc>
-        <w:tc>
-          <w:tcPr>
-            <w:tcW w:type="dxa" w:w="3120"/>
-            <w:shd w:val="clear" w:fill="1B2A4A"/>
-          </w:tcPr>
-          <w:p>
-            <w:r/>
-            <w:r>
-              <w:rPr>
-                <w:b/>
-                <w:color w:val="FFFFFF"/>
-                <w:sz w:val="20"/>
-              </w:rPr>
-              <w:t>Our answer</w:t>
-            </w:r>
-          </w:p>
-        </w:tc>
-      </w:tr>
-      <w:tr>
-        <w:tc>
-          <w:tcPr>
-            <w:tcW w:type="dxa" w:w="3120"/>
-          </w:tcPr>
-          <w:p>
-            <w:r/>
-            <w:r>
-              <w:rPr>
-                <w:sz w:val="20"/>
-              </w:rPr>
-              <w:t>Trolls / spam bots</w:t>
-            </w:r>
-          </w:p>
-        </w:tc>
-        <w:tc>
-          <w:tcPr>
-            <w:tcW w:type="dxa" w:w="3120"/>
-          </w:tcPr>
-          <w:p>
-            <w:r/>
-            <w:r>
-              <w:rPr>
-                <w:sz w:val="20"/>
-              </w:rPr>
-              <w:t>High</w:t>
-            </w:r>
-          </w:p>
-        </w:tc>
-        <w:tc>
-          <w:tcPr>
-            <w:tcW w:type="dxa" w:w="3120"/>
-          </w:tcPr>
-          <w:p>
-            <w:r/>
-            <w:r>
-              <w:rPr>
-                <w:sz w:val="20"/>
-              </w:rPr>
-              <w:t>IDs + bonds + juries + blocklists; abuse costs money</w:t>
-            </w:r>
-          </w:p>
-        </w:tc>
-      </w:tr>
-      <w:tr>
-        <w:tc>
-          <w:tcPr>
-            <w:tcW w:type="dxa" w:w="3120"/>
-            <w:shd w:val="clear" w:fill="EEF3F1"/>
-          </w:tcPr>
-          <w:p>
-            <w:r/>
-            <w:r>
-              <w:rPr>
-                <w:sz w:val="20"/>
-              </w:rPr>
-              <w:t>Big labs give AI away free</w:t>
-            </w:r>
-          </w:p>
-        </w:tc>
-        <w:tc>
-          <w:tcPr>
-            <w:tcW w:type="dxa" w:w="3120"/>
-            <w:shd w:val="clear" w:fill="EEF3F1"/>
-          </w:tcPr>
-          <w:p>
-            <w:r/>
-            <w:r>
-              <w:rPr>
-                <w:sz w:val="20"/>
-              </w:rPr>
-              <w:t>Medium</w:t>
-            </w:r>
-          </w:p>
-        </w:tc>
-        <w:tc>
-          <w:tcPr>
-            <w:tcW w:type="dxa" w:w="3120"/>
-            <w:shd w:val="clear" w:fill="EEF3F1"/>
-          </w:tcPr>
-          <w:p>
-            <w:r/>
-            <w:r>
-              <w:rPr>
-                <w:sz w:val="20"/>
-              </w:rPr>
-              <w:t>We compete on trust (debate + receipts), not raw IQ; data stays open</w:t>
-            </w:r>
-          </w:p>
-        </w:tc>
-      </w:tr>
-      <w:tr>
-        <w:tc>
-          <w:tcPr>
-            <w:tcW w:type="dxa" w:w="3120"/>
-          </w:tcPr>
-          <w:p>
-            <w:r/>
-            <w:r>
-              <w:rPr>
-                <w:sz w:val="20"/>
-              </w:rPr>
-              <w:t>Regulatory pressure</w:t>
-            </w:r>
-          </w:p>
-        </w:tc>
-        <w:tc>
-          <w:tcPr>
-            <w:tcW w:type="dxa" w:w="3120"/>
-          </w:tcPr>
-          <w:p>
-            <w:r/>
-            <w:r>
-              <w:rPr>
-                <w:sz w:val="20"/>
-              </w:rPr>
-              <w:t>Medium</w:t>
-            </w:r>
-          </w:p>
-        </w:tc>
-        <w:tc>
-          <w:tcPr>
-            <w:tcW w:type="dxa" w:w="3120"/>
-          </w:tcPr>
-          <w:p>
-            <w:r/>
-            <w:r>
-              <w:rPr>
-                <w:sz w:val="20"/>
-              </w:rPr>
-              <w:t>Weapons/embargo enforcement built in; signed audit trail</w:t>
-            </w:r>
-          </w:p>
-        </w:tc>
-      </w:tr>
-      <w:tr>
-        <w:tc>
-          <w:tcPr>
-            <w:tcW w:type="dxa" w:w="3120"/>
-            <w:shd w:val="clear" w:fill="EEF3F1"/>
-          </w:tcPr>
-          <w:p>
-            <w:r/>
-            <w:r>
-              <w:rPr>
-                <w:sz w:val="20"/>
-              </w:rPr>
-              <w:t>Crypto price swings</w:t>
-            </w:r>
-          </w:p>
-        </w:tc>
-        <w:tc>
-          <w:tcPr>
-            <w:tcW w:type="dxa" w:w="3120"/>
-            <w:shd w:val="clear" w:fill="EEF3F1"/>
-          </w:tcPr>
-          <w:p>
-            <w:r/>
-            <w:r>
-              <w:rPr>
-                <w:sz w:val="20"/>
-              </w:rPr>
-              <w:t>Medium</w:t>
-            </w:r>
-          </w:p>
-        </w:tc>
-        <w:tc>
-          <w:tcPr>
-            <w:tcW w:type="dxa" w:w="3120"/>
-            <w:shd w:val="clear" w:fill="EEF3F1"/>
-          </w:tcPr>
-          <w:p>
-            <w:r/>
-            <w:r>
-              <w:rPr>
-                <w:sz w:val="20"/>
-              </w:rPr>
-              <w:t>Credits are usage-denominated; TON is rails, not speculation</w:t>
-            </w:r>
-          </w:p>
-        </w:tc>
-      </w:tr>
-      <w:tr>
-        <w:tc>
-          <w:tcPr>
-            <w:tcW w:type="dxa" w:w="3120"/>
-          </w:tcPr>
-          <w:p>
-            <w:r/>
-            <w:r>
-              <w:rPr>
-                <w:sz w:val="20"/>
-              </w:rPr>
-              <w:t>Slow P2P on huge models</w:t>
-            </w:r>
-          </w:p>
-        </w:tc>
-        <w:tc>
-          <w:tcPr>
-            <w:tcW w:type="dxa" w:w="3120"/>
-          </w:tcPr>
-          <w:p>
-            <w:r/>
-            <w:r>
-              <w:rPr>
-                <w:sz w:val="20"/>
-              </w:rPr>
-              <w:t>Low</w:t>
-            </w:r>
-          </w:p>
-        </w:tc>
-        <w:tc>
-          <w:tcPr>
-            <w:tcW w:type="dxa" w:w="3120"/>
-          </w:tcPr>
-          <w:p>
-            <w:r/>
-            <w:r>
-              <w:rPr>
-                <w:sz w:val="20"/>
-              </w:rPr>
-              <w:t>Striped hosting + parity + replication; heavy users pin full weights</w:t>
-            </w:r>
-          </w:p>
-        </w:tc>
-      </w:tr>
-    </w:tbl>
-    <w:p/>
-    <w:p>
-      <w:pPr>
-        <w:pStyle w:val="Heading1"/>
-      </w:pPr>
-      <w:r>
-        <w:rPr>
-          <w:color w:val="1B2A4A"/>
-        </w:rPr>
-        <w:t>11. What we need next</w:t>
-      </w:r>
-    </w:p>
-    <w:p>
-      <w:pPr>
-        <w:pStyle w:val="ListBullet"/>
-      </w:pPr>
-      <w:r>
-        <w:rPr>
-          <w:b/>
-        </w:rPr>
-        <w:t xml:space="preserve">Keep the lights on: </w:t>
-      </w:r>
-      <w:r>
-        <w:t>hosting, audits, one designer to polish the novice experience.</w:t>
-      </w:r>
-    </w:p>
-    <w:p>
-      <w:pPr>
-        <w:pStyle w:val="ListBullet"/>
-      </w:pPr>
-      <w:r>
-        <w:rPr>
-          <w:b/>
-        </w:rPr>
-        <w:t xml:space="preserve">Seed the commons: </w:t>
-      </w:r>
-      <w:r>
-        <w:t>bounties for the first 10 community datasets and models.</w:t>
-      </w:r>
-    </w:p>
-    <w:p>
-      <w:pPr>
-        <w:pStyle w:val="ListBullet"/>
-      </w:pPr>
-      <w:r>
-        <w:rPr>
-          <w:b/>
-        </w:rPr>
-        <w:t xml:space="preserve">Invite anchors: </w:t>
-      </w:r>
-      <w:r>
-        <w:t>3 pilots (one campus, one DAO, one NGO) with open success metrics.</w:t>
-      </w:r>
-    </w:p>
-    <w:p>
-      <w:r>
-        <w:rPr>
-          <w:b/>
-        </w:rPr>
-        <w:t xml:space="preserve">12-month pledge: </w:t>
-      </w:r>
-      <w:r>
-        <w:rPr>
-          <w:i w:val="0"/>
-        </w:rPr>
-        <w:t>10,000 weekly debaters, 3 self-sustaining anchor communities, 5 community-seeded models, zero critical safety incidents, contributor payouts exceeding operating costs.</w:t>
-      </w:r>
-    </w:p>
-    <w:p>
-      <w:pPr>
-        <w:pStyle w:val="Heading1"/>
-      </w:pPr>
-      <w:r>
-        <w:rPr>
-          <w:color w:val="1B2A4A"/>
-        </w:rPr>
-        <w:t>Appendix A. Glossary</w:t>
-      </w:r>
-    </w:p>
-    <w:tbl>
-      <w:tblPr>
-        <w:tblStyle w:val="LightGrid-Accent1"/>
-        <w:tblW w:type="auto" w:w="0"/>
-        <w:jc w:val="center"/>
-        <w:tblLook w:firstColumn="1" w:firstRow="1" w:lastColumn="0" w:lastRow="0" w:noHBand="0" w:noVBand="1" w:val="04A0"/>
-      </w:tblPr>
-      <w:tblGrid>
-        <w:gridCol w:w="4680"/>
-        <w:gridCol w:w="4680"/>
-      </w:tblGrid>
-      <w:tr>
-        <w:tc>
-          <w:tcPr>
-            <w:tcW w:type="dxa" w:w="4680"/>
-            <w:shd w:val="clear" w:fill="1B2A4A"/>
-          </w:tcPr>
-          <w:p>
-            <w:r/>
-            <w:r>
-              <w:rPr>
-                <w:b/>
-                <w:color w:val="FFFFFF"/>
-                <w:sz w:val="20"/>
-              </w:rPr>
-              <w:t>Word</w:t>
-            </w:r>
-          </w:p>
-        </w:tc>
-        <w:tc>
-          <w:tcPr>
-            <w:tcW w:type="dxa" w:w="4680"/>
-            <w:shd w:val="clear" w:fill="1B2A4A"/>
-          </w:tcPr>
-          <w:p>
-            <w:r/>
-            <w:r>
-              <w:rPr>
-                <w:b/>
-                <w:color w:val="FFFFFF"/>
-                <w:sz w:val="20"/>
-              </w:rPr>
-              <w:t>Meaning</w:t>
-            </w:r>
-          </w:p>
-        </w:tc>
-      </w:tr>
-      <w:tr>
-        <w:tc>
-          <w:tcPr>
-            <w:tcW w:type="dxa" w:w="4680"/>
-          </w:tcPr>
-          <w:p>
-            <w:r/>
-            <w:r>
-              <w:rPr>
-                <w:sz w:val="20"/>
-              </w:rPr>
-              <w:t>Debate room</w:t>
-            </w:r>
-          </w:p>
-        </w:tc>
-        <w:tc>
-          <w:tcPr>
-            <w:tcW w:type="dxa" w:w="4680"/>
-          </w:tcPr>
-          <w:p>
-            <w:r/>
-            <w:r>
-              <w:rPr>
-                <w:sz w:val="20"/>
-              </w:rPr>
-              <w:t>Chat channel where AI characters argue before answering</w:t>
-            </w:r>
-          </w:p>
-        </w:tc>
-      </w:tr>
-      <w:tr>
-        <w:tc>
-          <w:tcPr>
-            <w:tcW w:type="dxa" w:w="4680"/>
-            <w:shd w:val="clear" w:fill="EEF3F1"/>
-          </w:tcPr>
-          <w:p>
-            <w:r/>
-            <w:r>
-              <w:rPr>
-                <w:sz w:val="20"/>
-              </w:rPr>
-              <w:t>Persona</w:t>
-            </w:r>
-          </w:p>
-        </w:tc>
-        <w:tc>
-          <w:tcPr>
-            <w:tcW w:type="dxa" w:w="4680"/>
-            <w:shd w:val="clear" w:fill="EEF3F1"/>
-          </w:tcPr>
-          <w:p>
-            <w:r/>
-            <w:r>
-              <w:rPr>
-                <w:sz w:val="20"/>
-              </w:rPr>
-              <w:t>One of 5 AI characters (proposer, checker, skeptic, summarizer, provoker)</w:t>
-            </w:r>
-          </w:p>
-        </w:tc>
-      </w:tr>
-      <w:tr>
-        <w:tc>
-          <w:tcPr>
-            <w:tcW w:type="dxa" w:w="4680"/>
-          </w:tcPr>
-          <w:p>
-            <w:r/>
-            <w:r>
-              <w:rPr>
-                <w:sz w:val="20"/>
-              </w:rPr>
-              <w:t>Confidence score</w:t>
-            </w:r>
-          </w:p>
-        </w:tc>
-        <w:tc>
-          <w:tcPr>
-            <w:tcW w:type="dxa" w:w="4680"/>
-          </w:tcPr>
-          <w:p>
-            <w:r/>
-            <w:r>
-              <w:rPr>
-                <w:sz w:val="20"/>
-              </w:rPr>
-              <w:t>How sure the AI is, shown as a number</w:t>
-            </w:r>
-          </w:p>
-        </w:tc>
-      </w:tr>
-      <w:tr>
-        <w:tc>
-          <w:tcPr>
-            <w:tcW w:type="dxa" w:w="4680"/>
-            <w:shd w:val="clear" w:fill="EEF3F1"/>
-          </w:tcPr>
-          <w:p>
-            <w:r/>
-            <w:r>
-              <w:rPr>
-                <w:sz w:val="20"/>
-              </w:rPr>
-              <w:t>Signed receipt</w:t>
-            </w:r>
-          </w:p>
-        </w:tc>
-        <w:tc>
-          <w:tcPr>
-            <w:tcW w:type="dxa" w:w="4680"/>
-            <w:shd w:val="clear" w:fill="EEF3F1"/>
-          </w:tcPr>
-          <w:p>
-            <w:r/>
-            <w:r>
-              <w:rPr>
-                <w:sz w:val="20"/>
-              </w:rPr>
-              <w:t>Tamper-proof record of who said what and who got paid</w:t>
-            </w:r>
-          </w:p>
-        </w:tc>
-      </w:tr>
-      <w:tr>
-        <w:tc>
-          <w:tcPr>
-            <w:tcW w:type="dxa" w:w="4680"/>
-          </w:tcPr>
-          <w:p>
-            <w:r/>
-            <w:r>
-              <w:rPr>
-                <w:sz w:val="20"/>
-              </w:rPr>
-              <w:t>TON credit</w:t>
-            </w:r>
-          </w:p>
-        </w:tc>
-        <w:tc>
-          <w:tcPr>
-            <w:tcW w:type="dxa" w:w="4680"/>
-          </w:tcPr>
-          <w:p>
-            <w:r/>
-            <w:r>
-              <w:rPr>
-                <w:sz w:val="20"/>
-              </w:rPr>
-              <w:t>Digital money on the TON network used for payments</w:t>
-            </w:r>
-          </w:p>
-        </w:tc>
-      </w:tr>
-      <w:tr>
-        <w:tc>
-          <w:tcPr>
-            <w:tcW w:type="dxa" w:w="4680"/>
-            <w:shd w:val="clear" w:fill="EEF3F1"/>
-          </w:tcPr>
-          <w:p>
-            <w:r/>
-            <w:r>
-              <w:rPr>
-                <w:sz w:val="20"/>
-              </w:rPr>
-              <w:t>Compute</w:t>
-            </w:r>
-          </w:p>
-        </w:tc>
-        <w:tc>
-          <w:tcPr>
-            <w:tcW w:type="dxa" w:w="4680"/>
-            <w:shd w:val="clear" w:fill="EEF3F1"/>
-          </w:tcPr>
-          <w:p>
-            <w:r/>
-            <w:r>
-              <w:rPr>
-                <w:sz w:val="20"/>
-              </w:rPr>
-              <w:t>Lending spare device power to help run AI</w:t>
-            </w:r>
-          </w:p>
-        </w:tc>
-      </w:tr>
-      <w:tr>
-        <w:tc>
-          <w:tcPr>
-            <w:tcW w:type="dxa" w:w="4680"/>
-          </w:tcPr>
-          <w:p>
-            <w:r/>
-            <w:r>
-              <w:rPr>
-                <w:sz w:val="20"/>
-              </w:rPr>
-              <w:t>Dataset / weights</w:t>
-            </w:r>
-          </w:p>
-        </w:tc>
-        <w:tc>
-          <w:tcPr>
-            <w:tcW w:type="dxa" w:w="4680"/>
-          </w:tcPr>
-          <w:p>
-            <w:r/>
-            <w:r>
-              <w:rPr>
-                <w:sz w:val="20"/>
-              </w:rPr>
-              <w:t>Textbooks (data) and trained brain (weights) behind AI</w:t>
-            </w:r>
-          </w:p>
-        </w:tc>
-      </w:tr>
-      <w:tr>
-        <w:tc>
-          <w:tcPr>
-            <w:tcW w:type="dxa" w:w="4680"/>
-            <w:shd w:val="clear" w:fill="EEF3F1"/>
-          </w:tcPr>
-          <w:p>
-            <w:r/>
-            <w:r>
-              <w:rPr>
-                <w:sz w:val="20"/>
-              </w:rPr>
-              <w:t>Peer-to-peer</w:t>
-            </w:r>
-          </w:p>
-        </w:tc>
-        <w:tc>
-          <w:tcPr>
-            <w:tcW w:type="dxa" w:w="4680"/>
-            <w:shd w:val="clear" w:fill="EEF3F1"/>
-          </w:tcPr>
-          <w:p>
-            <w:r/>
-            <w:r>
-              <w:rPr>
-                <w:sz w:val="20"/>
-              </w:rPr>
-              <w:t>Devices talk directly, not via one company's server</w:t>
-            </w:r>
-          </w:p>
-        </w:tc>
-      </w:tr>
-    </w:tbl>
-    <w:p/>
-    <w:p>
-      <w:pPr>
-        <w:pStyle w:val="Heading1"/>
-      </w:pPr>
-      <w:r>
-        <w:rPr>
-          <w:color w:val="1B2A4A"/>
-        </w:rPr>
-        <w:t>Appendix B. Deliberately NOT in this plan</w:t>
-      </w:r>
-    </w:p>
-    <w:p>
-      <w:pPr>
-        <w:pStyle w:val="ListBullet"/>
-      </w:pPr>
-      <w:r>
-        <w:t>No new coin to buy, no coin sale, no price promises.</w:t>
-      </w:r>
-    </w:p>
-    <w:p>
-      <w:pPr>
-        <w:pStyle w:val="ListBullet"/>
-      </w:pPr>
-      <w:r>
-        <w:t>No eat-your-data model: chats expire; only voted-valuable knowledge is kept.</w:t>
-      </w:r>
-    </w:p>
-    <w:p>
-      <w:pPr>
-        <w:pStyle w:val="ListBullet"/>
-      </w:pPr>
-      <w:r>
-        <w:t>No weapons work, no surveillance products, no selling user data — ever.</w:t>
+        <w:t>Contact: enterprise@shill.network • GitHub: https://github.com/your-org/shill • License: Apache 2.0</w:t>
       </w:r>
     </w:p>
     <w:sectPr>
       <w:pgSz w:w="12240" w:h="15840"/>
-      <w:pgMar w:top="1296" w:right="1440" w:bottom="1296" w:left="1440" w:header="720" w:footer="720" w:gutter="0"/>
+      <w:pgMar w:top="1152" w:right="1152" w:bottom="1152" w:left="1152" w:header="720" w:footer="720" w:gutter="0"/>
       <w:cols w:space="720"/>
       <w:docGrid w:linePitch="360"/>
     </w:sectPr>
@@ -2966,10 +2128,6 @@
     <w:name w:val="Normal"/>
     <w:qFormat/>
     <w:rsid w:val="00FC693F"/>
-    <w:rPr>
-      <w:rFonts w:ascii="Calibri" w:hAnsi="Calibri"/>
-      <w:sz w:val="22"/>
-    </w:rPr>
   </w:style>
   <w:style w:type="paragraph" w:styleId="Header">
     <w:name w:val="header"/>

</xml_diff>